<commit_message>
Add Model Risk Management Framework section (§3, Lecture 5)
Appended a six-subsection MRM Framework to both FINAL_REPORT.md and
FINAL_REPORT.docx covering: purpose/scope/performance requirements,
model choice justification (with GBM vs ABM note), data validation
and proxy assumptions, conceptual soundness, ongoing monitoring and
post-deployment change management, and outcome analysis/backtesting
diagnostics (Kupiec live result, ES elicitability note).

All subsequent sections renumbered §3→§4 … §12→§13.
build_report.js regenerated accordingly (783 paragraphs, validated).
</commit_message>
<xml_diff>
--- a/FINAL_REPORT.docx
+++ b/FINAL_REPORT.docx
@@ -3055,7 +3055,7 @@
           <w:sz w:val="32"/>
           <w:szCs w:val="32"/>
         </w:rPr>
-        <w:t xml:space="preserve">3  Application Screenshots</w:t>
+        <w:t xml:space="preserve">3  Model Risk Management Framework</w:t>
       </w:r>
     </w:p>
     <w:p>
@@ -3068,7 +3068,20 @@
           <w:sz w:val="22"/>
           <w:szCs w:val="22"/>
         </w:rPr>
-        <w:t xml:space="preserve">The following screenshots were captured from the live application running at localhost:8502 against five years of Yahoo Finance data (AAPL + MSFT, 2021-05-11 to 2026-05-08, 1,255 trading days).</w:t>
+        <w:t xml:space="preserve">This report documents the model according to a model risk management framework drawn from Lecture 5: purpose and scope, design justification, data analysis, implementation controls, testing, validation, limitations, and post-deployment monitoring.</w:t>
+      </w:r>
+    </w:p>
+    <w:p>
+      <w:pPr>
+        <w:spacing w:after="80" w:before="80"/>
+      </w:pPr>
+      <w:r>
+        <w:rPr>
+          <w:rFonts w:ascii="Arial" w:cs="Arial" w:eastAsia="Arial" w:hAnsi="Arial"/>
+          <w:sz w:val="22"/>
+          <w:szCs w:val="22"/>
+        </w:rPr>
+        <w:t xml:space="preserve">Post-crisis model risk management has expanded from point-in-time model validation toward full lifecycle governance, with effective governance structures, robust development and implementation practices, and sound ongoing validation.</w:t>
       </w:r>
     </w:p>
     <w:p/>
@@ -3086,7 +3099,3683 @@
           <w:sz w:val="26"/>
           <w:szCs w:val="26"/>
         </w:rPr>
-        <w:t xml:space="preserve">3.1  Tab 1 — Portfolio Input</w:t>
+        <w:t xml:space="preserve">3.1  Purpose, Scope, and Performance Requirements</w:t>
+      </w:r>
+    </w:p>
+    <w:p>
+      <w:pPr>
+        <w:spacing w:after="80" w:before="80"/>
+      </w:pPr>
+      <w:r>
+        <w:rPr>
+          <w:rFonts w:ascii="Arial" w:cs="Arial" w:eastAsia="Arial" w:hAnsi="Arial"/>
+          <w:sz w:val="22"/>
+          <w:szCs w:val="22"/>
+        </w:rPr>
+        <w:t xml:space="preserve">Lecture 5 states that the requirements document must define the model's purpose, scope of use, and performance requirements. The table below records each item for this system.</w:t>
+      </w:r>
+    </w:p>
+    <w:tbl>
+      <w:tblPr>
+        <w:tblW w:type="dxa" w:w="9360"/>
+        <w:tblBorders>
+          <w:top w:val="single" w:color="auto" w:sz="4"/>
+          <w:left w:val="single" w:color="auto" w:sz="4"/>
+          <w:bottom w:val="single" w:color="auto" w:sz="4"/>
+          <w:right w:val="single" w:color="auto" w:sz="4"/>
+          <w:insideH w:val="single" w:color="auto" w:sz="4"/>
+          <w:insideV w:val="single" w:color="auto" w:sz="4"/>
+        </w:tblBorders>
+      </w:tblPr>
+      <w:tblGrid>
+        <w:gridCol w:w="2340"/>
+        <w:gridCol w:w="7020"/>
+      </w:tblGrid>
+      <w:tr>
+        <w:trPr>
+          <w:tblHeader/>
+        </w:trPr>
+        <w:tc>
+          <w:tcPr>
+            <w:tcW w:type="dxa" w:w="2340"/>
+            <w:tcBorders>
+              <w:top w:val="single" w:color="CCCCCC" w:sz="1"/>
+              <w:left w:val="single" w:color="CCCCCC" w:sz="1"/>
+              <w:bottom w:val="single" w:color="CCCCCC" w:sz="1"/>
+              <w:right w:val="single" w:color="CCCCCC" w:sz="1"/>
+            </w:tcBorders>
+            <w:shd w:fill="D5E8F0" w:val="clear"/>
+            <w:tcMar>
+              <w:top w:type="dxa" w:w="80"/>
+              <w:left w:type="dxa" w:w="120"/>
+              <w:bottom w:type="dxa" w:w="80"/>
+              <w:right w:type="dxa" w:w="120"/>
+            </w:tcMar>
+          </w:tcPr>
+          <w:p>
+            <w:r>
+              <w:rPr>
+                <w:rFonts w:ascii="Arial" w:cs="Arial" w:eastAsia="Arial" w:hAnsi="Arial"/>
+                <w:b/>
+                <w:bCs/>
+                <w:sz w:val="18"/>
+                <w:szCs w:val="18"/>
+              </w:rPr>
+              <w:t xml:space="preserve">Item</w:t>
+            </w:r>
+          </w:p>
+        </w:tc>
+        <w:tc>
+          <w:tcPr>
+            <w:tcW w:type="dxa" w:w="7020"/>
+            <w:tcBorders>
+              <w:top w:val="single" w:color="CCCCCC" w:sz="1"/>
+              <w:left w:val="single" w:color="CCCCCC" w:sz="1"/>
+              <w:bottom w:val="single" w:color="CCCCCC" w:sz="1"/>
+              <w:right w:val="single" w:color="CCCCCC" w:sz="1"/>
+            </w:tcBorders>
+            <w:shd w:fill="D5E8F0" w:val="clear"/>
+            <w:tcMar>
+              <w:top w:type="dxa" w:w="80"/>
+              <w:left w:type="dxa" w:w="120"/>
+              <w:bottom w:type="dxa" w:w="80"/>
+              <w:right w:type="dxa" w:w="120"/>
+            </w:tcMar>
+          </w:tcPr>
+          <w:p>
+            <w:r>
+              <w:rPr>
+                <w:rFonts w:ascii="Arial" w:cs="Arial" w:eastAsia="Arial" w:hAnsi="Arial"/>
+                <w:b/>
+                <w:bCs/>
+                <w:sz w:val="18"/>
+                <w:szCs w:val="18"/>
+              </w:rPr>
+              <w:t xml:space="preserve">Documentation</w:t>
+            </w:r>
+          </w:p>
+        </w:tc>
+      </w:tr>
+      <w:tr>
+        <w:tc>
+          <w:tcPr>
+            <w:tcW w:type="dxa" w:w="2340"/>
+            <w:tcBorders>
+              <w:top w:val="single" w:color="CCCCCC" w:sz="1"/>
+              <w:left w:val="single" w:color="CCCCCC" w:sz="1"/>
+              <w:bottom w:val="single" w:color="CCCCCC" w:sz="1"/>
+              <w:right w:val="single" w:color="CCCCCC" w:sz="1"/>
+            </w:tcBorders>
+            <w:shd w:fill="FFFFFF" w:val="clear"/>
+            <w:tcMar>
+              <w:top w:type="dxa" w:w="80"/>
+              <w:left w:type="dxa" w:w="120"/>
+              <w:bottom w:type="dxa" w:w="80"/>
+              <w:right w:type="dxa" w:w="120"/>
+            </w:tcMar>
+          </w:tcPr>
+          <w:p>
+            <w:r>
+              <w:rPr>
+                <w:rFonts w:ascii="Arial" w:cs="Arial" w:eastAsia="Arial" w:hAnsi="Arial"/>
+                <w:b w:val="false"/>
+                <w:bCs w:val="false"/>
+                <w:sz w:val="18"/>
+                <w:szCs w:val="18"/>
+              </w:rPr>
+              <w:t xml:space="preserve">Purpose</w:t>
+            </w:r>
+          </w:p>
+        </w:tc>
+        <w:tc>
+          <w:tcPr>
+            <w:tcW w:type="dxa" w:w="7020"/>
+            <w:tcBorders>
+              <w:top w:val="single" w:color="CCCCCC" w:sz="1"/>
+              <w:left w:val="single" w:color="CCCCCC" w:sz="1"/>
+              <w:bottom w:val="single" w:color="CCCCCC" w:sz="1"/>
+              <w:right w:val="single" w:color="CCCCCC" w:sz="1"/>
+            </w:tcBorders>
+            <w:shd w:fill="FFFFFF" w:val="clear"/>
+            <w:tcMar>
+              <w:top w:type="dxa" w:w="80"/>
+              <w:left w:type="dxa" w:w="120"/>
+              <w:bottom w:type="dxa" w:w="80"/>
+              <w:right w:type="dxa" w:w="120"/>
+            </w:tcMar>
+          </w:tcPr>
+          <w:p>
+            <w:r>
+              <w:rPr>
+                <w:rFonts w:ascii="Arial" w:cs="Arial" w:eastAsia="Arial" w:hAnsi="Arial"/>
+                <w:b w:val="false"/>
+                <w:bCs w:val="false"/>
+                <w:sz w:val="18"/>
+                <w:szCs w:val="18"/>
+              </w:rPr>
+              <w:t xml:space="preserve">Course-level risk calculation system for portfolios of stocks and European options</w:t>
+            </w:r>
+          </w:p>
+        </w:tc>
+      </w:tr>
+      <w:tr>
+        <w:tc>
+          <w:tcPr>
+            <w:tcW w:type="dxa" w:w="2340"/>
+            <w:tcBorders>
+              <w:top w:val="single" w:color="CCCCCC" w:sz="1"/>
+              <w:left w:val="single" w:color="CCCCCC" w:sz="1"/>
+              <w:bottom w:val="single" w:color="CCCCCC" w:sz="1"/>
+              <w:right w:val="single" w:color="CCCCCC" w:sz="1"/>
+            </w:tcBorders>
+            <w:shd w:fill="FFFFFF" w:val="clear"/>
+            <w:tcMar>
+              <w:top w:type="dxa" w:w="80"/>
+              <w:left w:type="dxa" w:w="120"/>
+              <w:bottom w:type="dxa" w:w="80"/>
+              <w:right w:type="dxa" w:w="120"/>
+            </w:tcMar>
+          </w:tcPr>
+          <w:p>
+            <w:r>
+              <w:rPr>
+                <w:rFonts w:ascii="Arial" w:cs="Arial" w:eastAsia="Arial" w:hAnsi="Arial"/>
+                <w:b w:val="false"/>
+                <w:bCs w:val="false"/>
+                <w:sz w:val="18"/>
+                <w:szCs w:val="18"/>
+              </w:rPr>
+              <w:t xml:space="preserve">Scope</w:t>
+            </w:r>
+          </w:p>
+        </w:tc>
+        <w:tc>
+          <w:tcPr>
+            <w:tcW w:type="dxa" w:w="7020"/>
+            <w:tcBorders>
+              <w:top w:val="single" w:color="CCCCCC" w:sz="1"/>
+              <w:left w:val="single" w:color="CCCCCC" w:sz="1"/>
+              <w:bottom w:val="single" w:color="CCCCCC" w:sz="1"/>
+              <w:right w:val="single" w:color="CCCCCC" w:sz="1"/>
+            </w:tcBorders>
+            <w:shd w:fill="FFFFFF" w:val="clear"/>
+            <w:tcMar>
+              <w:top w:type="dxa" w:w="80"/>
+              <w:left w:type="dxa" w:w="120"/>
+              <w:bottom w:type="dxa" w:w="80"/>
+              <w:right w:type="dxa" w:w="120"/>
+            </w:tcMar>
+          </w:tcPr>
+          <w:p>
+            <w:r>
+              <w:rPr>
+                <w:rFonts w:ascii="Arial" w:cs="Arial" w:eastAsia="Arial" w:hAnsi="Arial"/>
+                <w:b w:val="false"/>
+                <w:bCs w:val="false"/>
+                <w:sz w:val="18"/>
+                <w:szCs w:val="18"/>
+              </w:rPr>
+              <w:t xml:space="preserve">Historical, parametric, and Monte Carlo VaR; historical and MC ES; walk-forward VaR backtesting with Kupiec, Christoffersen, and conditional-coverage tests; formula-sheet extension modules (lognormal VaR/ES, hazard, Merton, CDS, CVA, regulatory capital)</w:t>
+            </w:r>
+          </w:p>
+        </w:tc>
+      </w:tr>
+      <w:tr>
+        <w:tc>
+          <w:tcPr>
+            <w:tcW w:type="dxa" w:w="2340"/>
+            <w:tcBorders>
+              <w:top w:val="single" w:color="CCCCCC" w:sz="1"/>
+              <w:left w:val="single" w:color="CCCCCC" w:sz="1"/>
+              <w:bottom w:val="single" w:color="CCCCCC" w:sz="1"/>
+              <w:right w:val="single" w:color="CCCCCC" w:sz="1"/>
+            </w:tcBorders>
+            <w:shd w:fill="FFFFFF" w:val="clear"/>
+            <w:tcMar>
+              <w:top w:type="dxa" w:w="80"/>
+              <w:left w:type="dxa" w:w="120"/>
+              <w:bottom w:type="dxa" w:w="80"/>
+              <w:right w:type="dxa" w:w="120"/>
+            </w:tcMar>
+          </w:tcPr>
+          <w:p>
+            <w:r>
+              <w:rPr>
+                <w:rFonts w:ascii="Arial" w:cs="Arial" w:eastAsia="Arial" w:hAnsi="Arial"/>
+                <w:b w:val="false"/>
+                <w:bCs w:val="false"/>
+                <w:sz w:val="18"/>
+                <w:szCs w:val="18"/>
+              </w:rPr>
+              <w:t xml:space="preserve">Non-scope</w:t>
+            </w:r>
+          </w:p>
+        </w:tc>
+        <w:tc>
+          <w:tcPr>
+            <w:tcW w:type="dxa" w:w="7020"/>
+            <w:tcBorders>
+              <w:top w:val="single" w:color="CCCCCC" w:sz="1"/>
+              <w:left w:val="single" w:color="CCCCCC" w:sz="1"/>
+              <w:bottom w:val="single" w:color="CCCCCC" w:sz="1"/>
+              <w:right w:val="single" w:color="CCCCCC" w:sz="1"/>
+            </w:tcBorders>
+            <w:shd w:fill="FFFFFF" w:val="clear"/>
+            <w:tcMar>
+              <w:top w:type="dxa" w:w="80"/>
+              <w:left w:type="dxa" w:w="120"/>
+              <w:bottom w:type="dxa" w:w="80"/>
+              <w:right w:type="dxa" w:w="120"/>
+            </w:tcMar>
+          </w:tcPr>
+          <w:p>
+            <w:r>
+              <w:rPr>
+                <w:rFonts w:ascii="Arial" w:cs="Arial" w:eastAsia="Arial" w:hAnsi="Arial"/>
+                <w:b w:val="false"/>
+                <w:bCs w:val="false"/>
+                <w:sz w:val="18"/>
+                <w:szCs w:val="18"/>
+              </w:rPr>
+              <w:t xml:space="preserve">Production trading, official regulatory capital reporting, production XVA, CCAR/DFAST filing, American or path-dependent options</w:t>
+            </w:r>
+          </w:p>
+        </w:tc>
+      </w:tr>
+      <w:tr>
+        <w:tc>
+          <w:tcPr>
+            <w:tcW w:type="dxa" w:w="2340"/>
+            <w:tcBorders>
+              <w:top w:val="single" w:color="CCCCCC" w:sz="1"/>
+              <w:left w:val="single" w:color="CCCCCC" w:sz="1"/>
+              <w:bottom w:val="single" w:color="CCCCCC" w:sz="1"/>
+              <w:right w:val="single" w:color="CCCCCC" w:sz="1"/>
+            </w:tcBorders>
+            <w:shd w:fill="FFFFFF" w:val="clear"/>
+            <w:tcMar>
+              <w:top w:type="dxa" w:w="80"/>
+              <w:left w:type="dxa" w:w="120"/>
+              <w:bottom w:type="dxa" w:w="80"/>
+              <w:right w:type="dxa" w:w="120"/>
+            </w:tcMar>
+          </w:tcPr>
+          <w:p>
+            <w:r>
+              <w:rPr>
+                <w:rFonts w:ascii="Arial" w:cs="Arial" w:eastAsia="Arial" w:hAnsi="Arial"/>
+                <w:b w:val="false"/>
+                <w:bCs w:val="false"/>
+                <w:sz w:val="18"/>
+                <w:szCs w:val="18"/>
+              </w:rPr>
+              <w:t xml:space="preserve">Performance requirement</w:t>
+            </w:r>
+          </w:p>
+        </w:tc>
+        <w:tc>
+          <w:tcPr>
+            <w:tcW w:type="dxa" w:w="7020"/>
+            <w:tcBorders>
+              <w:top w:val="single" w:color="CCCCCC" w:sz="1"/>
+              <w:left w:val="single" w:color="CCCCCC" w:sz="1"/>
+              <w:bottom w:val="single" w:color="CCCCCC" w:sz="1"/>
+              <w:right w:val="single" w:color="CCCCCC" w:sz="1"/>
+            </w:tcBorders>
+            <w:shd w:fill="FFFFFF" w:val="clear"/>
+            <w:tcMar>
+              <w:top w:type="dxa" w:w="80"/>
+              <w:left w:type="dxa" w:w="120"/>
+              <w:bottom w:type="dxa" w:w="80"/>
+              <w:right w:type="dxa" w:w="120"/>
+            </w:tcMar>
+          </w:tcPr>
+          <w:p>
+            <w:r>
+              <w:rPr>
+                <w:rFonts w:ascii="Arial" w:cs="Arial" w:eastAsia="Arial" w:hAnsi="Arial"/>
+                <w:b w:val="false"/>
+                <w:bCs w:val="false"/>
+                <w:sz w:val="18"/>
+                <w:szCs w:val="18"/>
+              </w:rPr>
+              <w:t xml:space="preserve">Deterministic formulas pass strict unit tests at machine precision; historical and MC methods agree with known benchmarks within 1% relative tolerance for HW fixtures; the UI handles arbitrary stock/option portfolios without code changes</w:t>
+            </w:r>
+          </w:p>
+        </w:tc>
+      </w:tr>
+      <w:tr>
+        <w:tc>
+          <w:tcPr>
+            <w:tcW w:type="dxa" w:w="2340"/>
+            <w:tcBorders>
+              <w:top w:val="single" w:color="CCCCCC" w:sz="1"/>
+              <w:left w:val="single" w:color="CCCCCC" w:sz="1"/>
+              <w:bottom w:val="single" w:color="CCCCCC" w:sz="1"/>
+              <w:right w:val="single" w:color="CCCCCC" w:sz="1"/>
+            </w:tcBorders>
+            <w:shd w:fill="FFFFFF" w:val="clear"/>
+            <w:tcMar>
+              <w:top w:type="dxa" w:w="80"/>
+              <w:left w:type="dxa" w:w="120"/>
+              <w:bottom w:type="dxa" w:w="80"/>
+              <w:right w:type="dxa" w:w="120"/>
+            </w:tcMar>
+          </w:tcPr>
+          <w:p>
+            <w:r>
+              <w:rPr>
+                <w:rFonts w:ascii="Arial" w:cs="Arial" w:eastAsia="Arial" w:hAnsi="Arial"/>
+                <w:b w:val="false"/>
+                <w:bCs w:val="false"/>
+                <w:sz w:val="18"/>
+                <w:szCs w:val="18"/>
+              </w:rPr>
+              <w:t xml:space="preserve">Data requirement</w:t>
+            </w:r>
+          </w:p>
+        </w:tc>
+        <w:tc>
+          <w:tcPr>
+            <w:tcW w:type="dxa" w:w="7020"/>
+            <w:tcBorders>
+              <w:top w:val="single" w:color="CCCCCC" w:sz="1"/>
+              <w:left w:val="single" w:color="CCCCCC" w:sz="1"/>
+              <w:bottom w:val="single" w:color="CCCCCC" w:sz="1"/>
+              <w:right w:val="single" w:color="CCCCCC" w:sz="1"/>
+            </w:tcBorders>
+            <w:shd w:fill="FFFFFF" w:val="clear"/>
+            <w:tcMar>
+              <w:top w:type="dxa" w:w="80"/>
+              <w:left w:type="dxa" w:w="120"/>
+              <w:bottom w:type="dxa" w:w="80"/>
+              <w:right w:type="dxa" w:w="120"/>
+            </w:tcMar>
+          </w:tcPr>
+          <w:p>
+            <w:r>
+              <w:rPr>
+                <w:rFonts w:ascii="Arial" w:cs="Arial" w:eastAsia="Arial" w:hAnsi="Arial"/>
+                <w:b w:val="false"/>
+                <w:bCs w:val="false"/>
+                <w:sz w:val="18"/>
+                <w:szCs w:val="18"/>
+              </w:rPr>
+              <w:t xml:space="preserve">Aligned price histories, sufficient lookback (&gt;= 2 days), valid option inputs (positive spot/strike/vol/maturity), documented proxies for any inputs not sourced from official market data</w:t>
+            </w:r>
+          </w:p>
+        </w:tc>
+      </w:tr>
+    </w:tbl>
+    <w:p/>
+    <w:p>
+      <w:pPr>
+        <w:pStyle w:val="Heading2"/>
+        <w:spacing w:after="120" w:before="240"/>
+      </w:pPr>
+      <w:r>
+        <w:rPr>
+          <w:rFonts w:ascii="Arial" w:cs="Arial" w:eastAsia="Arial" w:hAnsi="Arial"/>
+          <w:b/>
+          <w:bCs/>
+          <w:color w:val="2E75B6"/>
+          <w:sz w:val="26"/>
+          <w:szCs w:val="26"/>
+        </w:rPr>
+        <w:t xml:space="preserve">3.2  Model Choice Justification</w:t>
+      </w:r>
+    </w:p>
+    <w:p>
+      <w:pPr>
+        <w:spacing w:after="80" w:before="80"/>
+      </w:pPr>
+      <w:r>
+        <w:rPr>
+          <w:rFonts w:ascii="Arial" w:cs="Arial" w:eastAsia="Arial" w:hAnsi="Arial"/>
+          <w:sz w:val="22"/>
+          <w:szCs w:val="22"/>
+        </w:rPr>
+        <w:t xml:space="preserve">Lecture 5 design document requirements state that model choice must be justified using published research or industry practice, with explanation of mathematical specification, analysis of assumptions and limitations, comparison of alternatives, and validation of subjective components.</w:t>
+      </w:r>
+    </w:p>
+    <w:tbl>
+      <w:tblPr>
+        <w:tblW w:type="dxa" w:w="9360"/>
+        <w:tblBorders>
+          <w:top w:val="single" w:color="auto" w:sz="4"/>
+          <w:left w:val="single" w:color="auto" w:sz="4"/>
+          <w:bottom w:val="single" w:color="auto" w:sz="4"/>
+          <w:right w:val="single" w:color="auto" w:sz="4"/>
+          <w:insideH w:val="single" w:color="auto" w:sz="4"/>
+          <w:insideV w:val="single" w:color="auto" w:sz="4"/>
+        </w:tblBorders>
+      </w:tblPr>
+      <w:tblGrid>
+        <w:gridCol w:w="2340"/>
+        <w:gridCol w:w="2340"/>
+        <w:gridCol w:w="2340"/>
+        <w:gridCol w:w="2340"/>
+      </w:tblGrid>
+      <w:tr>
+        <w:trPr>
+          <w:tblHeader/>
+        </w:trPr>
+        <w:tc>
+          <w:tcPr>
+            <w:tcW w:type="dxa" w:w="2340"/>
+            <w:tcBorders>
+              <w:top w:val="single" w:color="CCCCCC" w:sz="1"/>
+              <w:left w:val="single" w:color="CCCCCC" w:sz="1"/>
+              <w:bottom w:val="single" w:color="CCCCCC" w:sz="1"/>
+              <w:right w:val="single" w:color="CCCCCC" w:sz="1"/>
+            </w:tcBorders>
+            <w:shd w:fill="D5E8F0" w:val="clear"/>
+            <w:tcMar>
+              <w:top w:type="dxa" w:w="80"/>
+              <w:left w:type="dxa" w:w="120"/>
+              <w:bottom w:type="dxa" w:w="80"/>
+              <w:right w:type="dxa" w:w="120"/>
+            </w:tcMar>
+          </w:tcPr>
+          <w:p>
+            <w:r>
+              <w:rPr>
+                <w:rFonts w:ascii="Arial" w:cs="Arial" w:eastAsia="Arial" w:hAnsi="Arial"/>
+                <w:b/>
+                <w:bCs/>
+                <w:sz w:val="18"/>
+                <w:szCs w:val="18"/>
+              </w:rPr>
+              <w:t xml:space="preserve">Model choice</w:t>
+            </w:r>
+          </w:p>
+        </w:tc>
+        <w:tc>
+          <w:tcPr>
+            <w:tcW w:type="dxa" w:w="2340"/>
+            <w:tcBorders>
+              <w:top w:val="single" w:color="CCCCCC" w:sz="1"/>
+              <w:left w:val="single" w:color="CCCCCC" w:sz="1"/>
+              <w:bottom w:val="single" w:color="CCCCCC" w:sz="1"/>
+              <w:right w:val="single" w:color="CCCCCC" w:sz="1"/>
+            </w:tcBorders>
+            <w:shd w:fill="D5E8F0" w:val="clear"/>
+            <w:tcMar>
+              <w:top w:type="dxa" w:w="80"/>
+              <w:left w:type="dxa" w:w="120"/>
+              <w:bottom w:type="dxa" w:w="80"/>
+              <w:right w:type="dxa" w:w="120"/>
+            </w:tcMar>
+          </w:tcPr>
+          <w:p>
+            <w:r>
+              <w:rPr>
+                <w:rFonts w:ascii="Arial" w:cs="Arial" w:eastAsia="Arial" w:hAnsi="Arial"/>
+                <w:b/>
+                <w:bCs/>
+                <w:sz w:val="18"/>
+                <w:szCs w:val="18"/>
+              </w:rPr>
+              <w:t xml:space="preserve">Why chosen</w:t>
+            </w:r>
+          </w:p>
+        </w:tc>
+        <w:tc>
+          <w:tcPr>
+            <w:tcW w:type="dxa" w:w="2340"/>
+            <w:tcBorders>
+              <w:top w:val="single" w:color="CCCCCC" w:sz="1"/>
+              <w:left w:val="single" w:color="CCCCCC" w:sz="1"/>
+              <w:bottom w:val="single" w:color="CCCCCC" w:sz="1"/>
+              <w:right w:val="single" w:color="CCCCCC" w:sz="1"/>
+            </w:tcBorders>
+            <w:shd w:fill="D5E8F0" w:val="clear"/>
+            <w:tcMar>
+              <w:top w:type="dxa" w:w="80"/>
+              <w:left w:type="dxa" w:w="120"/>
+              <w:bottom w:type="dxa" w:w="80"/>
+              <w:right w:type="dxa" w:w="120"/>
+            </w:tcMar>
+          </w:tcPr>
+          <w:p>
+            <w:r>
+              <w:rPr>
+                <w:rFonts w:ascii="Arial" w:cs="Arial" w:eastAsia="Arial" w:hAnsi="Arial"/>
+                <w:b/>
+                <w:bCs/>
+                <w:sz w:val="18"/>
+                <w:szCs w:val="18"/>
+              </w:rPr>
+              <w:t xml:space="preserve">Alternative</w:t>
+            </w:r>
+          </w:p>
+        </w:tc>
+        <w:tc>
+          <w:tcPr>
+            <w:tcW w:type="dxa" w:w="2340"/>
+            <w:tcBorders>
+              <w:top w:val="single" w:color="CCCCCC" w:sz="1"/>
+              <w:left w:val="single" w:color="CCCCCC" w:sz="1"/>
+              <w:bottom w:val="single" w:color="CCCCCC" w:sz="1"/>
+              <w:right w:val="single" w:color="CCCCCC" w:sz="1"/>
+            </w:tcBorders>
+            <w:shd w:fill="D5E8F0" w:val="clear"/>
+            <w:tcMar>
+              <w:top w:type="dxa" w:w="80"/>
+              <w:left w:type="dxa" w:w="120"/>
+              <w:bottom w:type="dxa" w:w="80"/>
+              <w:right w:type="dxa" w:w="120"/>
+            </w:tcMar>
+          </w:tcPr>
+          <w:p>
+            <w:r>
+              <w:rPr>
+                <w:rFonts w:ascii="Arial" w:cs="Arial" w:eastAsia="Arial" w:hAnsi="Arial"/>
+                <w:b/>
+                <w:bCs/>
+                <w:sz w:val="18"/>
+                <w:szCs w:val="18"/>
+              </w:rPr>
+              <w:t xml:space="preserve">Limitation</w:t>
+            </w:r>
+          </w:p>
+        </w:tc>
+      </w:tr>
+      <w:tr>
+        <w:tc>
+          <w:tcPr>
+            <w:tcW w:type="dxa" w:w="2340"/>
+            <w:tcBorders>
+              <w:top w:val="single" w:color="CCCCCC" w:sz="1"/>
+              <w:left w:val="single" w:color="CCCCCC" w:sz="1"/>
+              <w:bottom w:val="single" w:color="CCCCCC" w:sz="1"/>
+              <w:right w:val="single" w:color="CCCCCC" w:sz="1"/>
+            </w:tcBorders>
+            <w:shd w:fill="FFFFFF" w:val="clear"/>
+            <w:tcMar>
+              <w:top w:type="dxa" w:w="80"/>
+              <w:left w:type="dxa" w:w="120"/>
+              <w:bottom w:type="dxa" w:w="80"/>
+              <w:right w:type="dxa" w:w="120"/>
+            </w:tcMar>
+          </w:tcPr>
+          <w:p>
+            <w:r>
+              <w:rPr>
+                <w:rFonts w:ascii="Arial" w:cs="Arial" w:eastAsia="Arial" w:hAnsi="Arial"/>
+                <w:b w:val="false"/>
+                <w:bCs w:val="false"/>
+                <w:sz w:val="18"/>
+                <w:szCs w:val="18"/>
+              </w:rPr>
+              <w:t xml:space="preserve">Historical simulation VaR</w:t>
+            </w:r>
+          </w:p>
+        </w:tc>
+        <w:tc>
+          <w:tcPr>
+            <w:tcW w:type="dxa" w:w="2340"/>
+            <w:tcBorders>
+              <w:top w:val="single" w:color="CCCCCC" w:sz="1"/>
+              <w:left w:val="single" w:color="CCCCCC" w:sz="1"/>
+              <w:bottom w:val="single" w:color="CCCCCC" w:sz="1"/>
+              <w:right w:val="single" w:color="CCCCCC" w:sz="1"/>
+            </w:tcBorders>
+            <w:shd w:fill="FFFFFF" w:val="clear"/>
+            <w:tcMar>
+              <w:top w:type="dxa" w:w="80"/>
+              <w:left w:type="dxa" w:w="120"/>
+              <w:bottom w:type="dxa" w:w="80"/>
+              <w:right w:type="dxa" w:w="120"/>
+            </w:tcMar>
+          </w:tcPr>
+          <w:p>
+            <w:r>
+              <w:rPr>
+                <w:rFonts w:ascii="Arial" w:cs="Arial" w:eastAsia="Arial" w:hAnsi="Arial"/>
+                <w:b w:val="false"/>
+                <w:bCs w:val="false"/>
+                <w:sz w:val="18"/>
+                <w:szCs w:val="18"/>
+              </w:rPr>
+              <w:t xml:space="preserve">Nonparametric; uses realised scenarios without distributional assumption</w:t>
+            </w:r>
+          </w:p>
+        </w:tc>
+        <w:tc>
+          <w:tcPr>
+            <w:tcW w:type="dxa" w:w="2340"/>
+            <w:tcBorders>
+              <w:top w:val="single" w:color="CCCCCC" w:sz="1"/>
+              <w:left w:val="single" w:color="CCCCCC" w:sz="1"/>
+              <w:bottom w:val="single" w:color="CCCCCC" w:sz="1"/>
+              <w:right w:val="single" w:color="CCCCCC" w:sz="1"/>
+            </w:tcBorders>
+            <w:shd w:fill="FFFFFF" w:val="clear"/>
+            <w:tcMar>
+              <w:top w:type="dxa" w:w="80"/>
+              <w:left w:type="dxa" w:w="120"/>
+              <w:bottom w:type="dxa" w:w="80"/>
+              <w:right w:type="dxa" w:w="120"/>
+            </w:tcMar>
+          </w:tcPr>
+          <w:p>
+            <w:r>
+              <w:rPr>
+                <w:rFonts w:ascii="Arial" w:cs="Arial" w:eastAsia="Arial" w:hAnsi="Arial"/>
+                <w:b w:val="false"/>
+                <w:bCs w:val="false"/>
+                <w:sz w:val="18"/>
+                <w:szCs w:val="18"/>
+              </w:rPr>
+              <w:t xml:space="preserve">Filtered historical simulation, EVT tail model</w:t>
+            </w:r>
+          </w:p>
+        </w:tc>
+        <w:tc>
+          <w:tcPr>
+            <w:tcW w:type="dxa" w:w="2340"/>
+            <w:tcBorders>
+              <w:top w:val="single" w:color="CCCCCC" w:sz="1"/>
+              <w:left w:val="single" w:color="CCCCCC" w:sz="1"/>
+              <w:bottom w:val="single" w:color="CCCCCC" w:sz="1"/>
+              <w:right w:val="single" w:color="CCCCCC" w:sz="1"/>
+            </w:tcBorders>
+            <w:shd w:fill="FFFFFF" w:val="clear"/>
+            <w:tcMar>
+              <w:top w:type="dxa" w:w="80"/>
+              <w:left w:type="dxa" w:w="120"/>
+              <w:bottom w:type="dxa" w:w="80"/>
+              <w:right w:type="dxa" w:w="120"/>
+            </w:tcMar>
+          </w:tcPr>
+          <w:p>
+            <w:r>
+              <w:rPr>
+                <w:rFonts w:ascii="Arial" w:cs="Arial" w:eastAsia="Arial" w:hAnsi="Arial"/>
+                <w:b w:val="false"/>
+                <w:bCs w:val="false"/>
+                <w:sz w:val="18"/>
+                <w:szCs w:val="18"/>
+              </w:rPr>
+              <w:t xml:space="preserve">History may not represent future; extreme quantiles unstable with short lookback</w:t>
+            </w:r>
+          </w:p>
+        </w:tc>
+      </w:tr>
+      <w:tr>
+        <w:tc>
+          <w:tcPr>
+            <w:tcW w:type="dxa" w:w="2340"/>
+            <w:tcBorders>
+              <w:top w:val="single" w:color="CCCCCC" w:sz="1"/>
+              <w:left w:val="single" w:color="CCCCCC" w:sz="1"/>
+              <w:bottom w:val="single" w:color="CCCCCC" w:sz="1"/>
+              <w:right w:val="single" w:color="CCCCCC" w:sz="1"/>
+            </w:tcBorders>
+            <w:shd w:fill="FFFFFF" w:val="clear"/>
+            <w:tcMar>
+              <w:top w:type="dxa" w:w="80"/>
+              <w:left w:type="dxa" w:w="120"/>
+              <w:bottom w:type="dxa" w:w="80"/>
+              <w:right w:type="dxa" w:w="120"/>
+            </w:tcMar>
+          </w:tcPr>
+          <w:p>
+            <w:r>
+              <w:rPr>
+                <w:rFonts w:ascii="Arial" w:cs="Arial" w:eastAsia="Arial" w:hAnsi="Arial"/>
+                <w:b w:val="false"/>
+                <w:bCs w:val="false"/>
+                <w:sz w:val="18"/>
+                <w:szCs w:val="18"/>
+              </w:rPr>
+              <w:t xml:space="preserve">Parametric delta-normal VaR</w:t>
+            </w:r>
+          </w:p>
+        </w:tc>
+        <w:tc>
+          <w:tcPr>
+            <w:tcW w:type="dxa" w:w="2340"/>
+            <w:tcBorders>
+              <w:top w:val="single" w:color="CCCCCC" w:sz="1"/>
+              <w:left w:val="single" w:color="CCCCCC" w:sz="1"/>
+              <w:bottom w:val="single" w:color="CCCCCC" w:sz="1"/>
+              <w:right w:val="single" w:color="CCCCCC" w:sz="1"/>
+            </w:tcBorders>
+            <w:shd w:fill="FFFFFF" w:val="clear"/>
+            <w:tcMar>
+              <w:top w:type="dxa" w:w="80"/>
+              <w:left w:type="dxa" w:w="120"/>
+              <w:bottom w:type="dxa" w:w="80"/>
+              <w:right w:type="dxa" w:w="120"/>
+            </w:tcMar>
+          </w:tcPr>
+          <w:p>
+            <w:r>
+              <w:rPr>
+                <w:rFonts w:ascii="Arial" w:cs="Arial" w:eastAsia="Arial" w:hAnsi="Arial"/>
+                <w:b w:val="false"/>
+                <w:bCs w:val="false"/>
+                <w:sz w:val="18"/>
+                <w:szCs w:val="18"/>
+              </w:rPr>
+              <w:t xml:space="preserve">Fast, transparent, analytically tractable normal approximation</w:t>
+            </w:r>
+          </w:p>
+        </w:tc>
+        <w:tc>
+          <w:tcPr>
+            <w:tcW w:type="dxa" w:w="2340"/>
+            <w:tcBorders>
+              <w:top w:val="single" w:color="CCCCCC" w:sz="1"/>
+              <w:left w:val="single" w:color="CCCCCC" w:sz="1"/>
+              <w:bottom w:val="single" w:color="CCCCCC" w:sz="1"/>
+              <w:right w:val="single" w:color="CCCCCC" w:sz="1"/>
+            </w:tcBorders>
+            <w:shd w:fill="FFFFFF" w:val="clear"/>
+            <w:tcMar>
+              <w:top w:type="dxa" w:w="80"/>
+              <w:left w:type="dxa" w:w="120"/>
+              <w:bottom w:type="dxa" w:w="80"/>
+              <w:right w:type="dxa" w:w="120"/>
+            </w:tcMar>
+          </w:tcPr>
+          <w:p>
+            <w:r>
+              <w:rPr>
+                <w:rFonts w:ascii="Arial" w:cs="Arial" w:eastAsia="Arial" w:hAnsi="Arial"/>
+                <w:b w:val="false"/>
+                <w:bCs w:val="false"/>
+                <w:sz w:val="18"/>
+                <w:szCs w:val="18"/>
+              </w:rPr>
+              <w:t xml:space="preserve">Delta-gamma, Cornish-Fisher expansion</w:t>
+            </w:r>
+          </w:p>
+        </w:tc>
+        <w:tc>
+          <w:tcPr>
+            <w:tcW w:type="dxa" w:w="2340"/>
+            <w:tcBorders>
+              <w:top w:val="single" w:color="CCCCCC" w:sz="1"/>
+              <w:left w:val="single" w:color="CCCCCC" w:sz="1"/>
+              <w:bottom w:val="single" w:color="CCCCCC" w:sz="1"/>
+              <w:right w:val="single" w:color="CCCCCC" w:sz="1"/>
+            </w:tcBorders>
+            <w:shd w:fill="FFFFFF" w:val="clear"/>
+            <w:tcMar>
+              <w:top w:type="dxa" w:w="80"/>
+              <w:left w:type="dxa" w:w="120"/>
+              <w:bottom w:type="dxa" w:w="80"/>
+              <w:right w:type="dxa" w:w="120"/>
+            </w:tcMar>
+          </w:tcPr>
+          <w:p>
+            <w:r>
+              <w:rPr>
+                <w:rFonts w:ascii="Arial" w:cs="Arial" w:eastAsia="Arial" w:hAnsi="Arial"/>
+                <w:b w:val="false"/>
+                <w:bCs w:val="false"/>
+                <w:sz w:val="18"/>
+                <w:szCs w:val="18"/>
+              </w:rPr>
+              <w:t xml:space="preserve">Weak for nonlinear option portfolios and fat-tailed return distributions</w:t>
+            </w:r>
+          </w:p>
+        </w:tc>
+      </w:tr>
+      <w:tr>
+        <w:tc>
+          <w:tcPr>
+            <w:tcW w:type="dxa" w:w="2340"/>
+            <w:tcBorders>
+              <w:top w:val="single" w:color="CCCCCC" w:sz="1"/>
+              <w:left w:val="single" w:color="CCCCCC" w:sz="1"/>
+              <w:bottom w:val="single" w:color="CCCCCC" w:sz="1"/>
+              <w:right w:val="single" w:color="CCCCCC" w:sz="1"/>
+            </w:tcBorders>
+            <w:shd w:fill="FFFFFF" w:val="clear"/>
+            <w:tcMar>
+              <w:top w:type="dxa" w:w="80"/>
+              <w:left w:type="dxa" w:w="120"/>
+              <w:bottom w:type="dxa" w:w="80"/>
+              <w:right w:type="dxa" w:w="120"/>
+            </w:tcMar>
+          </w:tcPr>
+          <w:p>
+            <w:r>
+              <w:rPr>
+                <w:rFonts w:ascii="Arial" w:cs="Arial" w:eastAsia="Arial" w:hAnsi="Arial"/>
+                <w:b w:val="false"/>
+                <w:bCs w:val="false"/>
+                <w:sz w:val="18"/>
+                <w:szCs w:val="18"/>
+              </w:rPr>
+              <w:t xml:space="preserve">Monte Carlo VaR</w:t>
+            </w:r>
+          </w:p>
+        </w:tc>
+        <w:tc>
+          <w:tcPr>
+            <w:tcW w:type="dxa" w:w="2340"/>
+            <w:tcBorders>
+              <w:top w:val="single" w:color="CCCCCC" w:sz="1"/>
+              <w:left w:val="single" w:color="CCCCCC" w:sz="1"/>
+              <w:bottom w:val="single" w:color="CCCCCC" w:sz="1"/>
+              <w:right w:val="single" w:color="CCCCCC" w:sz="1"/>
+            </w:tcBorders>
+            <w:shd w:fill="FFFFFF" w:val="clear"/>
+            <w:tcMar>
+              <w:top w:type="dxa" w:w="80"/>
+              <w:left w:type="dxa" w:w="120"/>
+              <w:bottom w:type="dxa" w:w="80"/>
+              <w:right w:type="dxa" w:w="120"/>
+            </w:tcMar>
+          </w:tcPr>
+          <w:p>
+            <w:r>
+              <w:rPr>
+                <w:rFonts w:ascii="Arial" w:cs="Arial" w:eastAsia="Arial" w:hAnsi="Arial"/>
+                <w:b w:val="false"/>
+                <w:bCs w:val="false"/>
+                <w:sz w:val="18"/>
+                <w:szCs w:val="18"/>
+              </w:rPr>
+              <w:t xml:space="preserve">Full repricing under simulated shocks; captures option nonlinearity better than delta-normal</w:t>
+            </w:r>
+          </w:p>
+        </w:tc>
+        <w:tc>
+          <w:tcPr>
+            <w:tcW w:type="dxa" w:w="2340"/>
+            <w:tcBorders>
+              <w:top w:val="single" w:color="CCCCCC" w:sz="1"/>
+              <w:left w:val="single" w:color="CCCCCC" w:sz="1"/>
+              <w:bottom w:val="single" w:color="CCCCCC" w:sz="1"/>
+              <w:right w:val="single" w:color="CCCCCC" w:sz="1"/>
+            </w:tcBorders>
+            <w:shd w:fill="FFFFFF" w:val="clear"/>
+            <w:tcMar>
+              <w:top w:type="dxa" w:w="80"/>
+              <w:left w:type="dxa" w:w="120"/>
+              <w:bottom w:type="dxa" w:w="80"/>
+              <w:right w:type="dxa" w:w="120"/>
+            </w:tcMar>
+          </w:tcPr>
+          <w:p>
+            <w:r>
+              <w:rPr>
+                <w:rFonts w:ascii="Arial" w:cs="Arial" w:eastAsia="Arial" w:hAnsi="Arial"/>
+                <w:b w:val="false"/>
+                <w:bCs w:val="false"/>
+                <w:sz w:val="18"/>
+                <w:szCs w:val="18"/>
+              </w:rPr>
+              <w:t xml:space="preserve">Bootstrap MC, scenario lattice</w:t>
+            </w:r>
+          </w:p>
+        </w:tc>
+        <w:tc>
+          <w:tcPr>
+            <w:tcW w:type="dxa" w:w="2340"/>
+            <w:tcBorders>
+              <w:top w:val="single" w:color="CCCCCC" w:sz="1"/>
+              <w:left w:val="single" w:color="CCCCCC" w:sz="1"/>
+              <w:bottom w:val="single" w:color="CCCCCC" w:sz="1"/>
+              <w:right w:val="single" w:color="CCCCCC" w:sz="1"/>
+            </w:tcBorders>
+            <w:shd w:fill="FFFFFF" w:val="clear"/>
+            <w:tcMar>
+              <w:top w:type="dxa" w:w="80"/>
+              <w:left w:type="dxa" w:w="120"/>
+              <w:bottom w:type="dxa" w:w="80"/>
+              <w:right w:type="dxa" w:w="120"/>
+            </w:tcMar>
+          </w:tcPr>
+          <w:p>
+            <w:r>
+              <w:rPr>
+                <w:rFonts w:ascii="Arial" w:cs="Arial" w:eastAsia="Arial" w:hAnsi="Arial"/>
+                <w:b w:val="false"/>
+                <w:bCs w:val="false"/>
+                <w:sz w:val="18"/>
+                <w:szCs w:val="18"/>
+              </w:rPr>
+              <w:t xml:space="preserve">Distributional assumption (multivariate normal) and MC sampling error</w:t>
+            </w:r>
+          </w:p>
+        </w:tc>
+      </w:tr>
+      <w:tr>
+        <w:tc>
+          <w:tcPr>
+            <w:tcW w:type="dxa" w:w="2340"/>
+            <w:tcBorders>
+              <w:top w:val="single" w:color="CCCCCC" w:sz="1"/>
+              <w:left w:val="single" w:color="CCCCCC" w:sz="1"/>
+              <w:bottom w:val="single" w:color="CCCCCC" w:sz="1"/>
+              <w:right w:val="single" w:color="CCCCCC" w:sz="1"/>
+            </w:tcBorders>
+            <w:shd w:fill="FFFFFF" w:val="clear"/>
+            <w:tcMar>
+              <w:top w:type="dxa" w:w="80"/>
+              <w:left w:type="dxa" w:w="120"/>
+              <w:bottom w:type="dxa" w:w="80"/>
+              <w:right w:type="dxa" w:w="120"/>
+            </w:tcMar>
+          </w:tcPr>
+          <w:p>
+            <w:r>
+              <w:rPr>
+                <w:rFonts w:ascii="Arial" w:cs="Arial" w:eastAsia="Arial" w:hAnsi="Arial"/>
+                <w:b w:val="false"/>
+                <w:bCs w:val="false"/>
+                <w:sz w:val="18"/>
+                <w:szCs w:val="18"/>
+              </w:rPr>
+              <w:t xml:space="preserve">Black-Scholes for option pricing</w:t>
+            </w:r>
+          </w:p>
+        </w:tc>
+        <w:tc>
+          <w:tcPr>
+            <w:tcW w:type="dxa" w:w="2340"/>
+            <w:tcBorders>
+              <w:top w:val="single" w:color="CCCCCC" w:sz="1"/>
+              <w:left w:val="single" w:color="CCCCCC" w:sz="1"/>
+              <w:bottom w:val="single" w:color="CCCCCC" w:sz="1"/>
+              <w:right w:val="single" w:color="CCCCCC" w:sz="1"/>
+            </w:tcBorders>
+            <w:shd w:fill="FFFFFF" w:val="clear"/>
+            <w:tcMar>
+              <w:top w:type="dxa" w:w="80"/>
+              <w:left w:type="dxa" w:w="120"/>
+              <w:bottom w:type="dxa" w:w="80"/>
+              <w:right w:type="dxa" w:w="120"/>
+            </w:tcMar>
+          </w:tcPr>
+          <w:p>
+            <w:r>
+              <w:rPr>
+                <w:rFonts w:ascii="Arial" w:cs="Arial" w:eastAsia="Arial" w:hAnsi="Arial"/>
+                <w:b w:val="false"/>
+                <w:bCs w:val="false"/>
+                <w:sz w:val="18"/>
+                <w:szCs w:val="18"/>
+              </w:rPr>
+              <w:t xml:space="preserve">Industry-standard European option pricer; closed-form, well-understood</w:t>
+            </w:r>
+          </w:p>
+        </w:tc>
+        <w:tc>
+          <w:tcPr>
+            <w:tcW w:type="dxa" w:w="2340"/>
+            <w:tcBorders>
+              <w:top w:val="single" w:color="CCCCCC" w:sz="1"/>
+              <w:left w:val="single" w:color="CCCCCC" w:sz="1"/>
+              <w:bottom w:val="single" w:color="CCCCCC" w:sz="1"/>
+              <w:right w:val="single" w:color="CCCCCC" w:sz="1"/>
+            </w:tcBorders>
+            <w:shd w:fill="FFFFFF" w:val="clear"/>
+            <w:tcMar>
+              <w:top w:type="dxa" w:w="80"/>
+              <w:left w:type="dxa" w:w="120"/>
+              <w:bottom w:type="dxa" w:w="80"/>
+              <w:right w:type="dxa" w:w="120"/>
+            </w:tcMar>
+          </w:tcPr>
+          <w:p>
+            <w:r>
+              <w:rPr>
+                <w:rFonts w:ascii="Arial" w:cs="Arial" w:eastAsia="Arial" w:hAnsi="Arial"/>
+                <w:b w:val="false"/>
+                <w:bCs w:val="false"/>
+                <w:sz w:val="18"/>
+                <w:szCs w:val="18"/>
+              </w:rPr>
+              <w:t xml:space="preserve">Local vol (Dupire), stochastic vol (Heston), binomial lattice</w:t>
+            </w:r>
+          </w:p>
+        </w:tc>
+        <w:tc>
+          <w:tcPr>
+            <w:tcW w:type="dxa" w:w="2340"/>
+            <w:tcBorders>
+              <w:top w:val="single" w:color="CCCCCC" w:sz="1"/>
+              <w:left w:val="single" w:color="CCCCCC" w:sz="1"/>
+              <w:bottom w:val="single" w:color="CCCCCC" w:sz="1"/>
+              <w:right w:val="single" w:color="CCCCCC" w:sz="1"/>
+            </w:tcBorders>
+            <w:shd w:fill="FFFFFF" w:val="clear"/>
+            <w:tcMar>
+              <w:top w:type="dxa" w:w="80"/>
+              <w:left w:type="dxa" w:w="120"/>
+              <w:bottom w:type="dxa" w:w="80"/>
+              <w:right w:type="dxa" w:w="120"/>
+            </w:tcMar>
+          </w:tcPr>
+          <w:p>
+            <w:r>
+              <w:rPr>
+                <w:rFonts w:ascii="Arial" w:cs="Arial" w:eastAsia="Arial" w:hAnsi="Arial"/>
+                <w:b w:val="false"/>
+                <w:bCs w:val="false"/>
+                <w:sz w:val="18"/>
+                <w:szCs w:val="18"/>
+              </w:rPr>
+              <w:t xml:space="preserve">Constant volatility; no early exercise; smile/skew risk not captured</w:t>
+            </w:r>
+          </w:p>
+        </w:tc>
+      </w:tr>
+      <w:tr>
+        <w:tc>
+          <w:tcPr>
+            <w:tcW w:type="dxa" w:w="2340"/>
+            <w:tcBorders>
+              <w:top w:val="single" w:color="CCCCCC" w:sz="1"/>
+              <w:left w:val="single" w:color="CCCCCC" w:sz="1"/>
+              <w:bottom w:val="single" w:color="CCCCCC" w:sz="1"/>
+              <w:right w:val="single" w:color="CCCCCC" w:sz="1"/>
+            </w:tcBorders>
+            <w:shd w:fill="FFFFFF" w:val="clear"/>
+            <w:tcMar>
+              <w:top w:type="dxa" w:w="80"/>
+              <w:left w:type="dxa" w:w="120"/>
+              <w:bottom w:type="dxa" w:w="80"/>
+              <w:right w:type="dxa" w:w="120"/>
+            </w:tcMar>
+          </w:tcPr>
+          <w:p>
+            <w:r>
+              <w:rPr>
+                <w:rFonts w:ascii="Arial" w:cs="Arial" w:eastAsia="Arial" w:hAnsi="Arial"/>
+                <w:b w:val="false"/>
+                <w:bCs w:val="false"/>
+                <w:sz w:val="18"/>
+                <w:szCs w:val="18"/>
+              </w:rPr>
+              <w:t xml:space="preserve">GBM log-returns</w:t>
+            </w:r>
+          </w:p>
+        </w:tc>
+        <w:tc>
+          <w:tcPr>
+            <w:tcW w:type="dxa" w:w="2340"/>
+            <w:tcBorders>
+              <w:top w:val="single" w:color="CCCCCC" w:sz="1"/>
+              <w:left w:val="single" w:color="CCCCCC" w:sz="1"/>
+              <w:bottom w:val="single" w:color="CCCCCC" w:sz="1"/>
+              <w:right w:val="single" w:color="CCCCCC" w:sz="1"/>
+            </w:tcBorders>
+            <w:shd w:fill="FFFFFF" w:val="clear"/>
+            <w:tcMar>
+              <w:top w:type="dxa" w:w="80"/>
+              <w:left w:type="dxa" w:w="120"/>
+              <w:bottom w:type="dxa" w:w="80"/>
+              <w:right w:type="dxa" w:w="120"/>
+            </w:tcMar>
+          </w:tcPr>
+          <w:p>
+            <w:r>
+              <w:rPr>
+                <w:rFonts w:ascii="Arial" w:cs="Arial" w:eastAsia="Arial" w:hAnsi="Arial"/>
+                <w:b w:val="false"/>
+                <w:bCs w:val="false"/>
+                <w:sz w:val="18"/>
+                <w:szCs w:val="18"/>
+              </w:rPr>
+              <w:t xml:space="preserve">Ensures non-negative simulated stock prices; standard equity assumption</w:t>
+            </w:r>
+          </w:p>
+        </w:tc>
+        <w:tc>
+          <w:tcPr>
+            <w:tcW w:type="dxa" w:w="2340"/>
+            <w:tcBorders>
+              <w:top w:val="single" w:color="CCCCCC" w:sz="1"/>
+              <w:left w:val="single" w:color="CCCCCC" w:sz="1"/>
+              <w:bottom w:val="single" w:color="CCCCCC" w:sz="1"/>
+              <w:right w:val="single" w:color="CCCCCC" w:sz="1"/>
+            </w:tcBorders>
+            <w:shd w:fill="FFFFFF" w:val="clear"/>
+            <w:tcMar>
+              <w:top w:type="dxa" w:w="80"/>
+              <w:left w:type="dxa" w:w="120"/>
+              <w:bottom w:type="dxa" w:w="80"/>
+              <w:right w:type="dxa" w:w="120"/>
+            </w:tcMar>
+          </w:tcPr>
+          <w:p>
+            <w:r>
+              <w:rPr>
+                <w:rFonts w:ascii="Arial" w:cs="Arial" w:eastAsia="Arial" w:hAnsi="Arial"/>
+                <w:b w:val="false"/>
+                <w:bCs w:val="false"/>
+                <w:sz w:val="18"/>
+                <w:szCs w:val="18"/>
+              </w:rPr>
+              <w:t xml:space="preserve">Arithmetic Brownian Motion (Bachelier)</w:t>
+            </w:r>
+          </w:p>
+        </w:tc>
+        <w:tc>
+          <w:tcPr>
+            <w:tcW w:type="dxa" w:w="2340"/>
+            <w:tcBorders>
+              <w:top w:val="single" w:color="CCCCCC" w:sz="1"/>
+              <w:left w:val="single" w:color="CCCCCC" w:sz="1"/>
+              <w:bottom w:val="single" w:color="CCCCCC" w:sz="1"/>
+              <w:right w:val="single" w:color="CCCCCC" w:sz="1"/>
+            </w:tcBorders>
+            <w:shd w:fill="FFFFFF" w:val="clear"/>
+            <w:tcMar>
+              <w:top w:type="dxa" w:w="80"/>
+              <w:left w:type="dxa" w:w="120"/>
+              <w:bottom w:type="dxa" w:w="80"/>
+              <w:right w:type="dxa" w:w="120"/>
+            </w:tcMar>
+          </w:tcPr>
+          <w:p>
+            <w:r>
+              <w:rPr>
+                <w:rFonts w:ascii="Arial" w:cs="Arial" w:eastAsia="Arial" w:hAnsi="Arial"/>
+                <w:b w:val="false"/>
+                <w:bCs w:val="false"/>
+                <w:sz w:val="18"/>
+                <w:szCs w:val="18"/>
+              </w:rPr>
+              <w:t xml:space="preserve">Log-return aggregation convexity; not suitable for near-zero or negative risk factors</w:t>
+            </w:r>
+          </w:p>
+        </w:tc>
+      </w:tr>
+      <w:tr>
+        <w:tc>
+          <w:tcPr>
+            <w:tcW w:type="dxa" w:w="2340"/>
+            <w:tcBorders>
+              <w:top w:val="single" w:color="CCCCCC" w:sz="1"/>
+              <w:left w:val="single" w:color="CCCCCC" w:sz="1"/>
+              <w:bottom w:val="single" w:color="CCCCCC" w:sz="1"/>
+              <w:right w:val="single" w:color="CCCCCC" w:sz="1"/>
+            </w:tcBorders>
+            <w:shd w:fill="FFFFFF" w:val="clear"/>
+            <w:tcMar>
+              <w:top w:type="dxa" w:w="80"/>
+              <w:left w:type="dxa" w:w="120"/>
+              <w:bottom w:type="dxa" w:w="80"/>
+              <w:right w:type="dxa" w:w="120"/>
+            </w:tcMar>
+          </w:tcPr>
+          <w:p>
+            <w:r>
+              <w:rPr>
+                <w:rFonts w:ascii="Arial" w:cs="Arial" w:eastAsia="Arial" w:hAnsi="Arial"/>
+                <w:b w:val="false"/>
+                <w:bCs w:val="false"/>
+                <w:sz w:val="18"/>
+                <w:szCs w:val="18"/>
+              </w:rPr>
+              <w:t xml:space="preserve">EWMA / rolling window estimation</w:t>
+            </w:r>
+          </w:p>
+        </w:tc>
+        <w:tc>
+          <w:tcPr>
+            <w:tcW w:type="dxa" w:w="2340"/>
+            <w:tcBorders>
+              <w:top w:val="single" w:color="CCCCCC" w:sz="1"/>
+              <w:left w:val="single" w:color="CCCCCC" w:sz="1"/>
+              <w:bottom w:val="single" w:color="CCCCCC" w:sz="1"/>
+              <w:right w:val="single" w:color="CCCCCC" w:sz="1"/>
+            </w:tcBorders>
+            <w:shd w:fill="FFFFFF" w:val="clear"/>
+            <w:tcMar>
+              <w:top w:type="dxa" w:w="80"/>
+              <w:left w:type="dxa" w:w="120"/>
+              <w:bottom w:type="dxa" w:w="80"/>
+              <w:right w:type="dxa" w:w="120"/>
+            </w:tcMar>
+          </w:tcPr>
+          <w:p>
+            <w:r>
+              <w:rPr>
+                <w:rFonts w:ascii="Arial" w:cs="Arial" w:eastAsia="Arial" w:hAnsi="Arial"/>
+                <w:b w:val="false"/>
+                <w:bCs w:val="false"/>
+                <w:sz w:val="18"/>
+                <w:szCs w:val="18"/>
+              </w:rPr>
+              <w:t xml:space="preserve">Course-aligned estimators; transparent; EWMA allows faster reaction to volatility clustering</w:t>
+            </w:r>
+          </w:p>
+        </w:tc>
+        <w:tc>
+          <w:tcPr>
+            <w:tcW w:type="dxa" w:w="2340"/>
+            <w:tcBorders>
+              <w:top w:val="single" w:color="CCCCCC" w:sz="1"/>
+              <w:left w:val="single" w:color="CCCCCC" w:sz="1"/>
+              <w:bottom w:val="single" w:color="CCCCCC" w:sz="1"/>
+              <w:right w:val="single" w:color="CCCCCC" w:sz="1"/>
+            </w:tcBorders>
+            <w:shd w:fill="FFFFFF" w:val="clear"/>
+            <w:tcMar>
+              <w:top w:type="dxa" w:w="80"/>
+              <w:left w:type="dxa" w:w="120"/>
+              <w:bottom w:type="dxa" w:w="80"/>
+              <w:right w:type="dxa" w:w="120"/>
+            </w:tcMar>
+          </w:tcPr>
+          <w:p>
+            <w:r>
+              <w:rPr>
+                <w:rFonts w:ascii="Arial" w:cs="Arial" w:eastAsia="Arial" w:hAnsi="Arial"/>
+                <w:b w:val="false"/>
+                <w:bCs w:val="false"/>
+                <w:sz w:val="18"/>
+                <w:szCs w:val="18"/>
+              </w:rPr>
+              <w:t xml:space="preserve">GARCH(1,1), DCC-GARCH</w:t>
+            </w:r>
+          </w:p>
+        </w:tc>
+        <w:tc>
+          <w:tcPr>
+            <w:tcW w:type="dxa" w:w="2340"/>
+            <w:tcBorders>
+              <w:top w:val="single" w:color="CCCCCC" w:sz="1"/>
+              <w:left w:val="single" w:color="CCCCCC" w:sz="1"/>
+              <w:bottom w:val="single" w:color="CCCCCC" w:sz="1"/>
+              <w:right w:val="single" w:color="CCCCCC" w:sz="1"/>
+            </w:tcBorders>
+            <w:shd w:fill="FFFFFF" w:val="clear"/>
+            <w:tcMar>
+              <w:top w:type="dxa" w:w="80"/>
+              <w:left w:type="dxa" w:w="120"/>
+              <w:bottom w:type="dxa" w:w="80"/>
+              <w:right w:type="dxa" w:w="120"/>
+            </w:tcMar>
+          </w:tcPr>
+          <w:p>
+            <w:r>
+              <w:rPr>
+                <w:rFonts w:ascii="Arial" w:cs="Arial" w:eastAsia="Arial" w:hAnsi="Arial"/>
+                <w:b w:val="false"/>
+                <w:bCs w:val="false"/>
+                <w:sz w:val="18"/>
+                <w:szCs w:val="18"/>
+              </w:rPr>
+              <w:t xml:space="preserve">Parameter sensitivity; no volatility regime detection</w:t>
+            </w:r>
+          </w:p>
+        </w:tc>
+      </w:tr>
+    </w:tbl>
+    <w:p>
+      <w:pPr>
+        <w:spacing w:after="80" w:before="80"/>
+      </w:pPr>
+      <w:r>
+        <w:rPr>
+          <w:rFonts w:ascii="Arial" w:cs="Arial" w:eastAsia="Arial" w:hAnsi="Arial"/>
+          <w:sz w:val="22"/>
+          <w:szCs w:val="22"/>
+        </w:rPr>
+        <w:t xml:space="preserve">GBM vs ABM note: GBM is used for equity risk factors that must remain non-negative (stock prices). For risk factors that can be negative — such as interest rate spreads or credit spreads — Arithmetic Brownian Motion (Bachelier model) is more appropriate. Our system scope is limited to equity underlyings, so GBM is applied throughout. This is explicitly noted as a scope boundary.</w:t>
+      </w:r>
+    </w:p>
+    <w:p/>
+    <w:p>
+      <w:pPr>
+        <w:pStyle w:val="Heading2"/>
+        <w:spacing w:after="120" w:before="240"/>
+      </w:pPr>
+      <w:r>
+        <w:rPr>
+          <w:rFonts w:ascii="Arial" w:cs="Arial" w:eastAsia="Arial" w:hAnsi="Arial"/>
+          <w:b/>
+          <w:bCs/>
+          <w:color w:val="2E75B6"/>
+          <w:sz w:val="26"/>
+          <w:szCs w:val="26"/>
+        </w:rPr>
+        <w:t xml:space="preserve">3.3  Data Validation and Proxy Assumptions</w:t>
+      </w:r>
+    </w:p>
+    <w:p>
+      <w:pPr>
+        <w:spacing w:after="80" w:before="80"/>
+      </w:pPr>
+      <w:r>
+        <w:rPr>
+          <w:rFonts w:ascii="Arial" w:cs="Arial" w:eastAsia="Arial" w:hAnsi="Arial"/>
+          <w:sz w:val="22"/>
+          <w:szCs w:val="22"/>
+        </w:rPr>
+        <w:t xml:space="preserve">Lecture 5 emphasises that data is critical and that problematic data gives questionable results. It requires documentation of data used, assessment of quality and suitability, identification and justification of proxies, and documentation of any cleaning or smoothing assumptions.</w:t>
+      </w:r>
+    </w:p>
+    <w:tbl>
+      <w:tblPr>
+        <w:tblW w:type="dxa" w:w="9360"/>
+        <w:tblBorders>
+          <w:top w:val="single" w:color="auto" w:sz="4"/>
+          <w:left w:val="single" w:color="auto" w:sz="4"/>
+          <w:bottom w:val="single" w:color="auto" w:sz="4"/>
+          <w:right w:val="single" w:color="auto" w:sz="4"/>
+          <w:insideH w:val="single" w:color="auto" w:sz="4"/>
+          <w:insideV w:val="single" w:color="auto" w:sz="4"/>
+        </w:tblBorders>
+      </w:tblPr>
+      <w:tblGrid>
+        <w:gridCol w:w="2340"/>
+        <w:gridCol w:w="7020"/>
+      </w:tblGrid>
+      <w:tr>
+        <w:trPr>
+          <w:tblHeader/>
+        </w:trPr>
+        <w:tc>
+          <w:tcPr>
+            <w:tcW w:type="dxa" w:w="2340"/>
+            <w:tcBorders>
+              <w:top w:val="single" w:color="CCCCCC" w:sz="1"/>
+              <w:left w:val="single" w:color="CCCCCC" w:sz="1"/>
+              <w:bottom w:val="single" w:color="CCCCCC" w:sz="1"/>
+              <w:right w:val="single" w:color="CCCCCC" w:sz="1"/>
+            </w:tcBorders>
+            <w:shd w:fill="D5E8F0" w:val="clear"/>
+            <w:tcMar>
+              <w:top w:type="dxa" w:w="80"/>
+              <w:left w:type="dxa" w:w="120"/>
+              <w:bottom w:type="dxa" w:w="80"/>
+              <w:right w:type="dxa" w:w="120"/>
+            </w:tcMar>
+          </w:tcPr>
+          <w:p>
+            <w:r>
+              <w:rPr>
+                <w:rFonts w:ascii="Arial" w:cs="Arial" w:eastAsia="Arial" w:hAnsi="Arial"/>
+                <w:b/>
+                <w:bCs/>
+                <w:sz w:val="18"/>
+                <w:szCs w:val="18"/>
+              </w:rPr>
+              <w:t xml:space="preserve">Data item</w:t>
+            </w:r>
+          </w:p>
+        </w:tc>
+        <w:tc>
+          <w:tcPr>
+            <w:tcW w:type="dxa" w:w="7020"/>
+            <w:tcBorders>
+              <w:top w:val="single" w:color="CCCCCC" w:sz="1"/>
+              <w:left w:val="single" w:color="CCCCCC" w:sz="1"/>
+              <w:bottom w:val="single" w:color="CCCCCC" w:sz="1"/>
+              <w:right w:val="single" w:color="CCCCCC" w:sz="1"/>
+            </w:tcBorders>
+            <w:shd w:fill="D5E8F0" w:val="clear"/>
+            <w:tcMar>
+              <w:top w:type="dxa" w:w="80"/>
+              <w:left w:type="dxa" w:w="120"/>
+              <w:bottom w:type="dxa" w:w="80"/>
+              <w:right w:type="dxa" w:w="120"/>
+            </w:tcMar>
+          </w:tcPr>
+          <w:p>
+            <w:r>
+              <w:rPr>
+                <w:rFonts w:ascii="Arial" w:cs="Arial" w:eastAsia="Arial" w:hAnsi="Arial"/>
+                <w:b/>
+                <w:bCs/>
+                <w:sz w:val="18"/>
+                <w:szCs w:val="18"/>
+              </w:rPr>
+              <w:t xml:space="preserve">Validation required</w:t>
+            </w:r>
+          </w:p>
+        </w:tc>
+      </w:tr>
+      <w:tr>
+        <w:tc>
+          <w:tcPr>
+            <w:tcW w:type="dxa" w:w="2340"/>
+            <w:tcBorders>
+              <w:top w:val="single" w:color="CCCCCC" w:sz="1"/>
+              <w:left w:val="single" w:color="CCCCCC" w:sz="1"/>
+              <w:bottom w:val="single" w:color="CCCCCC" w:sz="1"/>
+              <w:right w:val="single" w:color="CCCCCC" w:sz="1"/>
+            </w:tcBorders>
+            <w:shd w:fill="FFFFFF" w:val="clear"/>
+            <w:tcMar>
+              <w:top w:type="dxa" w:w="80"/>
+              <w:left w:type="dxa" w:w="120"/>
+              <w:bottom w:type="dxa" w:w="80"/>
+              <w:right w:type="dxa" w:w="120"/>
+            </w:tcMar>
+          </w:tcPr>
+          <w:p>
+            <w:r>
+              <w:rPr>
+                <w:rFonts w:ascii="Arial" w:cs="Arial" w:eastAsia="Arial" w:hAnsi="Arial"/>
+                <w:b w:val="false"/>
+                <w:bCs w:val="false"/>
+                <w:sz w:val="18"/>
+                <w:szCs w:val="18"/>
+              </w:rPr>
+              <w:t xml:space="preserve">Price histories</w:t>
+            </w:r>
+          </w:p>
+        </w:tc>
+        <w:tc>
+          <w:tcPr>
+            <w:tcW w:type="dxa" w:w="7020"/>
+            <w:tcBorders>
+              <w:top w:val="single" w:color="CCCCCC" w:sz="1"/>
+              <w:left w:val="single" w:color="CCCCCC" w:sz="1"/>
+              <w:bottom w:val="single" w:color="CCCCCC" w:sz="1"/>
+              <w:right w:val="single" w:color="CCCCCC" w:sz="1"/>
+            </w:tcBorders>
+            <w:shd w:fill="FFFFFF" w:val="clear"/>
+            <w:tcMar>
+              <w:top w:type="dxa" w:w="80"/>
+              <w:left w:type="dxa" w:w="120"/>
+              <w:bottom w:type="dxa" w:w="80"/>
+              <w:right w:type="dxa" w:w="120"/>
+            </w:tcMar>
+          </w:tcPr>
+          <w:p>
+            <w:r>
+              <w:rPr>
+                <w:rFonts w:ascii="Arial" w:cs="Arial" w:eastAsia="Arial" w:hAnsi="Arial"/>
+                <w:b w:val="false"/>
+                <w:bCs w:val="false"/>
+                <w:sz w:val="18"/>
+                <w:szCs w:val="18"/>
+              </w:rPr>
+              <w:t xml:space="preserve">No missing dates after alignment; no impossible prices (negative or zero for equity); no stale sequences (constant price over consecutive days)</w:t>
+            </w:r>
+          </w:p>
+        </w:tc>
+      </w:tr>
+      <w:tr>
+        <w:tc>
+          <w:tcPr>
+            <w:tcW w:type="dxa" w:w="2340"/>
+            <w:tcBorders>
+              <w:top w:val="single" w:color="CCCCCC" w:sz="1"/>
+              <w:left w:val="single" w:color="CCCCCC" w:sz="1"/>
+              <w:bottom w:val="single" w:color="CCCCCC" w:sz="1"/>
+              <w:right w:val="single" w:color="CCCCCC" w:sz="1"/>
+            </w:tcBorders>
+            <w:shd w:fill="FFFFFF" w:val="clear"/>
+            <w:tcMar>
+              <w:top w:type="dxa" w:w="80"/>
+              <w:left w:type="dxa" w:w="120"/>
+              <w:bottom w:type="dxa" w:w="80"/>
+              <w:right w:type="dxa" w:w="120"/>
+            </w:tcMar>
+          </w:tcPr>
+          <w:p>
+            <w:r>
+              <w:rPr>
+                <w:rFonts w:ascii="Arial" w:cs="Arial" w:eastAsia="Arial" w:hAnsi="Arial"/>
+                <w:b w:val="false"/>
+                <w:bCs w:val="false"/>
+                <w:sz w:val="18"/>
+                <w:szCs w:val="18"/>
+              </w:rPr>
+              <w:t xml:space="preserve">Return series</w:t>
+            </w:r>
+          </w:p>
+        </w:tc>
+        <w:tc>
+          <w:tcPr>
+            <w:tcW w:type="dxa" w:w="7020"/>
+            <w:tcBorders>
+              <w:top w:val="single" w:color="CCCCCC" w:sz="1"/>
+              <w:left w:val="single" w:color="CCCCCC" w:sz="1"/>
+              <w:bottom w:val="single" w:color="CCCCCC" w:sz="1"/>
+              <w:right w:val="single" w:color="CCCCCC" w:sz="1"/>
+            </w:tcBorders>
+            <w:shd w:fill="FFFFFF" w:val="clear"/>
+            <w:tcMar>
+              <w:top w:type="dxa" w:w="80"/>
+              <w:left w:type="dxa" w:w="120"/>
+              <w:bottom w:type="dxa" w:w="80"/>
+              <w:right w:type="dxa" w:w="120"/>
+            </w:tcMar>
+          </w:tcPr>
+          <w:p>
+            <w:r>
+              <w:rPr>
+                <w:rFonts w:ascii="Arial" w:cs="Arial" w:eastAsia="Arial" w:hAnsi="Arial"/>
+                <w:b w:val="false"/>
+                <w:bCs w:val="false"/>
+                <w:sz w:val="18"/>
+                <w:szCs w:val="18"/>
+              </w:rPr>
+              <w:t xml:space="preserve">Outlier review; return distribution summary; window-size check (lookback must be &gt; number of positions for full-rank covariance)</w:t>
+            </w:r>
+          </w:p>
+        </w:tc>
+      </w:tr>
+      <w:tr>
+        <w:tc>
+          <w:tcPr>
+            <w:tcW w:type="dxa" w:w="2340"/>
+            <w:tcBorders>
+              <w:top w:val="single" w:color="CCCCCC" w:sz="1"/>
+              <w:left w:val="single" w:color="CCCCCC" w:sz="1"/>
+              <w:bottom w:val="single" w:color="CCCCCC" w:sz="1"/>
+              <w:right w:val="single" w:color="CCCCCC" w:sz="1"/>
+            </w:tcBorders>
+            <w:shd w:fill="FFFFFF" w:val="clear"/>
+            <w:tcMar>
+              <w:top w:type="dxa" w:w="80"/>
+              <w:left w:type="dxa" w:w="120"/>
+              <w:bottom w:type="dxa" w:w="80"/>
+              <w:right w:type="dxa" w:w="120"/>
+            </w:tcMar>
+          </w:tcPr>
+          <w:p>
+            <w:r>
+              <w:rPr>
+                <w:rFonts w:ascii="Arial" w:cs="Arial" w:eastAsia="Arial" w:hAnsi="Arial"/>
+                <w:b w:val="false"/>
+                <w:bCs w:val="false"/>
+                <w:sz w:val="18"/>
+                <w:szCs w:val="18"/>
+              </w:rPr>
+              <w:t xml:space="preserve">Option inputs</w:t>
+            </w:r>
+          </w:p>
+        </w:tc>
+        <w:tc>
+          <w:tcPr>
+            <w:tcW w:type="dxa" w:w="7020"/>
+            <w:tcBorders>
+              <w:top w:val="single" w:color="CCCCCC" w:sz="1"/>
+              <w:left w:val="single" w:color="CCCCCC" w:sz="1"/>
+              <w:bottom w:val="single" w:color="CCCCCC" w:sz="1"/>
+              <w:right w:val="single" w:color="CCCCCC" w:sz="1"/>
+            </w:tcBorders>
+            <w:shd w:fill="FFFFFF" w:val="clear"/>
+            <w:tcMar>
+              <w:top w:type="dxa" w:w="80"/>
+              <w:left w:type="dxa" w:w="120"/>
+              <w:bottom w:type="dxa" w:w="80"/>
+              <w:right w:type="dxa" w:w="120"/>
+            </w:tcMar>
+          </w:tcPr>
+          <w:p>
+            <w:r>
+              <w:rPr>
+                <w:rFonts w:ascii="Arial" w:cs="Arial" w:eastAsia="Arial" w:hAnsi="Arial"/>
+                <w:b w:val="false"/>
+                <w:bCs w:val="false"/>
+                <w:sz w:val="18"/>
+                <w:szCs w:val="18"/>
+              </w:rPr>
+              <w:t xml:space="preserve">Positive spot, strike, volatility, and time-to-maturity; risk-free rate and dividend yield explicitly documented</w:t>
+            </w:r>
+          </w:p>
+        </w:tc>
+      </w:tr>
+      <w:tr>
+        <w:tc>
+          <w:tcPr>
+            <w:tcW w:type="dxa" w:w="2340"/>
+            <w:tcBorders>
+              <w:top w:val="single" w:color="CCCCCC" w:sz="1"/>
+              <w:left w:val="single" w:color="CCCCCC" w:sz="1"/>
+              <w:bottom w:val="single" w:color="CCCCCC" w:sz="1"/>
+              <w:right w:val="single" w:color="CCCCCC" w:sz="1"/>
+            </w:tcBorders>
+            <w:shd w:fill="FFFFFF" w:val="clear"/>
+            <w:tcMar>
+              <w:top w:type="dxa" w:w="80"/>
+              <w:left w:type="dxa" w:w="120"/>
+              <w:bottom w:type="dxa" w:w="80"/>
+              <w:right w:type="dxa" w:w="120"/>
+            </w:tcMar>
+          </w:tcPr>
+          <w:p>
+            <w:r>
+              <w:rPr>
+                <w:rFonts w:ascii="Arial" w:cs="Arial" w:eastAsia="Arial" w:hAnsi="Arial"/>
+                <w:b w:val="false"/>
+                <w:bCs w:val="false"/>
+                <w:sz w:val="18"/>
+                <w:szCs w:val="18"/>
+              </w:rPr>
+              <w:t xml:space="preserve">Proxies</w:t>
+            </w:r>
+          </w:p>
+        </w:tc>
+        <w:tc>
+          <w:tcPr>
+            <w:tcW w:type="dxa" w:w="7020"/>
+            <w:tcBorders>
+              <w:top w:val="single" w:color="CCCCCC" w:sz="1"/>
+              <w:left w:val="single" w:color="CCCCCC" w:sz="1"/>
+              <w:bottom w:val="single" w:color="CCCCCC" w:sz="1"/>
+              <w:right w:val="single" w:color="CCCCCC" w:sz="1"/>
+            </w:tcBorders>
+            <w:shd w:fill="FFFFFF" w:val="clear"/>
+            <w:tcMar>
+              <w:top w:type="dxa" w:w="80"/>
+              <w:left w:type="dxa" w:w="120"/>
+              <w:bottom w:type="dxa" w:w="80"/>
+              <w:right w:type="dxa" w:w="120"/>
+            </w:tcMar>
+          </w:tcPr>
+          <w:p>
+            <w:r>
+              <w:rPr>
+                <w:rFonts w:ascii="Arial" w:cs="Arial" w:eastAsia="Arial" w:hAnsi="Arial"/>
+                <w:b w:val="false"/>
+                <w:bCs w:val="false"/>
+                <w:sz w:val="18"/>
+                <w:szCs w:val="18"/>
+              </w:rPr>
+              <w:t xml:space="preserve">Yahoo Finance adjusted close is used as a proxy for official market data — not official Bloomberg or exchange-direct data. Documented as a data limitation, not a validated production data source</w:t>
+            </w:r>
+          </w:p>
+        </w:tc>
+      </w:tr>
+      <w:tr>
+        <w:tc>
+          <w:tcPr>
+            <w:tcW w:type="dxa" w:w="2340"/>
+            <w:tcBorders>
+              <w:top w:val="single" w:color="CCCCCC" w:sz="1"/>
+              <w:left w:val="single" w:color="CCCCCC" w:sz="1"/>
+              <w:bottom w:val="single" w:color="CCCCCC" w:sz="1"/>
+              <w:right w:val="single" w:color="CCCCCC" w:sz="1"/>
+            </w:tcBorders>
+            <w:shd w:fill="FFFFFF" w:val="clear"/>
+            <w:tcMar>
+              <w:top w:type="dxa" w:w="80"/>
+              <w:left w:type="dxa" w:w="120"/>
+              <w:bottom w:type="dxa" w:w="80"/>
+              <w:right w:type="dxa" w:w="120"/>
+            </w:tcMar>
+          </w:tcPr>
+          <w:p>
+            <w:r>
+              <w:rPr>
+                <w:rFonts w:ascii="Arial" w:cs="Arial" w:eastAsia="Arial" w:hAnsi="Arial"/>
+                <w:b w:val="false"/>
+                <w:bCs w:val="false"/>
+                <w:sz w:val="18"/>
+                <w:szCs w:val="18"/>
+              </w:rPr>
+              <w:t xml:space="preserve">Data cleaning</w:t>
+            </w:r>
+          </w:p>
+        </w:tc>
+        <w:tc>
+          <w:tcPr>
+            <w:tcW w:type="dxa" w:w="7020"/>
+            <w:tcBorders>
+              <w:top w:val="single" w:color="CCCCCC" w:sz="1"/>
+              <w:left w:val="single" w:color="CCCCCC" w:sz="1"/>
+              <w:bottom w:val="single" w:color="CCCCCC" w:sz="1"/>
+              <w:right w:val="single" w:color="CCCCCC" w:sz="1"/>
+            </w:tcBorders>
+            <w:shd w:fill="FFFFFF" w:val="clear"/>
+            <w:tcMar>
+              <w:top w:type="dxa" w:w="80"/>
+              <w:left w:type="dxa" w:w="120"/>
+              <w:bottom w:type="dxa" w:w="80"/>
+              <w:right w:type="dxa" w:w="120"/>
+            </w:tcMar>
+          </w:tcPr>
+          <w:p>
+            <w:r>
+              <w:rPr>
+                <w:rFonts w:ascii="Arial" w:cs="Arial" w:eastAsia="Arial" w:hAnsi="Arial"/>
+                <w:b w:val="false"/>
+                <w:bCs w:val="false"/>
+                <w:sz w:val="18"/>
+                <w:szCs w:val="18"/>
+              </w:rPr>
+              <w:t xml:space="preserve">Dropped NaN rows after alignment are documented; no price interpolation is performed; date alignment uses outer join then forward-fill only if explicitly requested</w:t>
+            </w:r>
+          </w:p>
+        </w:tc>
+      </w:tr>
+      <w:tr>
+        <w:tc>
+          <w:tcPr>
+            <w:tcW w:type="dxa" w:w="2340"/>
+            <w:tcBorders>
+              <w:top w:val="single" w:color="CCCCCC" w:sz="1"/>
+              <w:left w:val="single" w:color="CCCCCC" w:sz="1"/>
+              <w:bottom w:val="single" w:color="CCCCCC" w:sz="1"/>
+              <w:right w:val="single" w:color="CCCCCC" w:sz="1"/>
+            </w:tcBorders>
+            <w:shd w:fill="FFFFFF" w:val="clear"/>
+            <w:tcMar>
+              <w:top w:type="dxa" w:w="80"/>
+              <w:left w:type="dxa" w:w="120"/>
+              <w:bottom w:type="dxa" w:w="80"/>
+              <w:right w:type="dxa" w:w="120"/>
+            </w:tcMar>
+          </w:tcPr>
+          <w:p>
+            <w:r>
+              <w:rPr>
+                <w:rFonts w:ascii="Arial" w:cs="Arial" w:eastAsia="Arial" w:hAnsi="Arial"/>
+                <w:b w:val="false"/>
+                <w:bCs w:val="false"/>
+                <w:sz w:val="18"/>
+                <w:szCs w:val="18"/>
+              </w:rPr>
+              <w:t xml:space="preserve">Covariance matrix</w:t>
+            </w:r>
+          </w:p>
+        </w:tc>
+        <w:tc>
+          <w:tcPr>
+            <w:tcW w:type="dxa" w:w="7020"/>
+            <w:tcBorders>
+              <w:top w:val="single" w:color="CCCCCC" w:sz="1"/>
+              <w:left w:val="single" w:color="CCCCCC" w:sz="1"/>
+              <w:bottom w:val="single" w:color="CCCCCC" w:sz="1"/>
+              <w:right w:val="single" w:color="CCCCCC" w:sz="1"/>
+            </w:tcBorders>
+            <w:shd w:fill="FFFFFF" w:val="clear"/>
+            <w:tcMar>
+              <w:top w:type="dxa" w:w="80"/>
+              <w:left w:type="dxa" w:w="120"/>
+              <w:bottom w:type="dxa" w:w="80"/>
+              <w:right w:type="dxa" w:w="120"/>
+            </w:tcMar>
+          </w:tcPr>
+          <w:p>
+            <w:r>
+              <w:rPr>
+                <w:rFonts w:ascii="Arial" w:cs="Arial" w:eastAsia="Arial" w:hAnsi="Arial"/>
+                <w:b w:val="false"/>
+                <w:bCs w:val="false"/>
+                <w:sz w:val="18"/>
+                <w:szCs w:val="18"/>
+              </w:rPr>
+              <w:t xml:space="preserve">Checked for symmetry; checked for positive semidefiniteness or handled gracefully via numerical regularisation</w:t>
+            </w:r>
+          </w:p>
+        </w:tc>
+      </w:tr>
+    </w:tbl>
+    <w:p>
+      <w:pPr>
+        <w:spacing w:after="80" w:before="80"/>
+      </w:pPr>
+      <w:r>
+        <w:rPr>
+          <w:rFonts w:ascii="Arial" w:cs="Arial" w:eastAsia="Arial" w:hAnsi="Arial"/>
+          <w:sz w:val="22"/>
+          <w:szCs w:val="22"/>
+        </w:rPr>
+        <w:t xml:space="preserve">Data limitation statement: The main data limitation is that downloaded or user-supplied historical prices may contain missing observations, stale prices, corporate-action issues, or inconsistent calendar alignments. The engine treats data validation as part of model validation rather than as a cosmetic preprocessing step. Any proxy data source should be disclosed to end users as part of the model's usage documentation.</w:t>
+      </w:r>
+    </w:p>
+    <w:p/>
+    <w:p>
+      <w:pPr>
+        <w:pStyle w:val="Heading2"/>
+        <w:spacing w:after="120" w:before="240"/>
+      </w:pPr>
+      <w:r>
+        <w:rPr>
+          <w:rFonts w:ascii="Arial" w:cs="Arial" w:eastAsia="Arial" w:hAnsi="Arial"/>
+          <w:b/>
+          <w:bCs/>
+          <w:color w:val="2E75B6"/>
+          <w:sz w:val="26"/>
+          <w:szCs w:val="26"/>
+        </w:rPr>
+        <w:t xml:space="preserve">3.4  Conceptual Soundness</w:t>
+      </w:r>
+    </w:p>
+    <w:p>
+      <w:pPr>
+        <w:spacing w:after="80" w:before="80"/>
+      </w:pPr>
+      <w:r>
+        <w:rPr>
+          <w:rFonts w:ascii="Arial" w:cs="Arial" w:eastAsia="Arial" w:hAnsi="Arial"/>
+          <w:sz w:val="22"/>
+          <w:szCs w:val="22"/>
+        </w:rPr>
+        <w:t xml:space="preserve">Lecture 5 states that validation should evaluate conceptual soundness: independent experts should review documentation, confirm the model is appropriate for its task, assess design and construction quality, review empirical evidence, check for sound judgment in model selection, and run sensitivity analysis.</w:t>
+      </w:r>
+    </w:p>
+    <w:tbl>
+      <w:tblPr>
+        <w:tblW w:type="dxa" w:w="9360"/>
+        <w:tblBorders>
+          <w:top w:val="single" w:color="auto" w:sz="4"/>
+          <w:left w:val="single" w:color="auto" w:sz="4"/>
+          <w:bottom w:val="single" w:color="auto" w:sz="4"/>
+          <w:right w:val="single" w:color="auto" w:sz="4"/>
+          <w:insideH w:val="single" w:color="auto" w:sz="4"/>
+          <w:insideV w:val="single" w:color="auto" w:sz="4"/>
+        </w:tblBorders>
+      </w:tblPr>
+      <w:tblGrid>
+        <w:gridCol w:w="3900"/>
+        <w:gridCol w:w="5460"/>
+      </w:tblGrid>
+      <w:tr>
+        <w:trPr>
+          <w:tblHeader/>
+        </w:trPr>
+        <w:tc>
+          <w:tcPr>
+            <w:tcW w:type="dxa" w:w="3900"/>
+            <w:tcBorders>
+              <w:top w:val="single" w:color="CCCCCC" w:sz="1"/>
+              <w:left w:val="single" w:color="CCCCCC" w:sz="1"/>
+              <w:bottom w:val="single" w:color="CCCCCC" w:sz="1"/>
+              <w:right w:val="single" w:color="CCCCCC" w:sz="1"/>
+            </w:tcBorders>
+            <w:shd w:fill="D5E8F0" w:val="clear"/>
+            <w:tcMar>
+              <w:top w:type="dxa" w:w="80"/>
+              <w:left w:type="dxa" w:w="120"/>
+              <w:bottom w:type="dxa" w:w="80"/>
+              <w:right w:type="dxa" w:w="120"/>
+            </w:tcMar>
+          </w:tcPr>
+          <w:p>
+            <w:r>
+              <w:rPr>
+                <w:rFonts w:ascii="Arial" w:cs="Arial" w:eastAsia="Arial" w:hAnsi="Arial"/>
+                <w:b/>
+                <w:bCs/>
+                <w:sz w:val="18"/>
+                <w:szCs w:val="18"/>
+              </w:rPr>
+              <w:t xml:space="preserve">Conceptual soundness check</w:t>
+            </w:r>
+          </w:p>
+        </w:tc>
+        <w:tc>
+          <w:tcPr>
+            <w:tcW w:type="dxa" w:w="5460"/>
+            <w:tcBorders>
+              <w:top w:val="single" w:color="CCCCCC" w:sz="1"/>
+              <w:left w:val="single" w:color="CCCCCC" w:sz="1"/>
+              <w:bottom w:val="single" w:color="CCCCCC" w:sz="1"/>
+              <w:right w:val="single" w:color="CCCCCC" w:sz="1"/>
+            </w:tcBorders>
+            <w:shd w:fill="D5E8F0" w:val="clear"/>
+            <w:tcMar>
+              <w:top w:type="dxa" w:w="80"/>
+              <w:left w:type="dxa" w:w="120"/>
+              <w:bottom w:type="dxa" w:w="80"/>
+              <w:right w:type="dxa" w:w="120"/>
+            </w:tcMar>
+          </w:tcPr>
+          <w:p>
+            <w:r>
+              <w:rPr>
+                <w:rFonts w:ascii="Arial" w:cs="Arial" w:eastAsia="Arial" w:hAnsi="Arial"/>
+                <w:b/>
+                <w:bCs/>
+                <w:sz w:val="18"/>
+                <w:szCs w:val="18"/>
+              </w:rPr>
+              <w:t xml:space="preserve">Evidence in this project</w:t>
+            </w:r>
+          </w:p>
+        </w:tc>
+      </w:tr>
+      <w:tr>
+        <w:tc>
+          <w:tcPr>
+            <w:tcW w:type="dxa" w:w="3900"/>
+            <w:tcBorders>
+              <w:top w:val="single" w:color="CCCCCC" w:sz="1"/>
+              <w:left w:val="single" w:color="CCCCCC" w:sz="1"/>
+              <w:bottom w:val="single" w:color="CCCCCC" w:sz="1"/>
+              <w:right w:val="single" w:color="CCCCCC" w:sz="1"/>
+            </w:tcBorders>
+            <w:shd w:fill="FFFFFF" w:val="clear"/>
+            <w:tcMar>
+              <w:top w:type="dxa" w:w="80"/>
+              <w:left w:type="dxa" w:w="120"/>
+              <w:bottom w:type="dxa" w:w="80"/>
+              <w:right w:type="dxa" w:w="120"/>
+            </w:tcMar>
+          </w:tcPr>
+          <w:p>
+            <w:r>
+              <w:rPr>
+                <w:rFonts w:ascii="Arial" w:cs="Arial" w:eastAsia="Arial" w:hAnsi="Arial"/>
+                <w:b w:val="false"/>
+                <w:bCs w:val="false"/>
+                <w:sz w:val="18"/>
+                <w:szCs w:val="18"/>
+              </w:rPr>
+              <w:t xml:space="preserve">Appropriate for intended task</w:t>
+            </w:r>
+          </w:p>
+        </w:tc>
+        <w:tc>
+          <w:tcPr>
+            <w:tcW w:type="dxa" w:w="5460"/>
+            <w:tcBorders>
+              <w:top w:val="single" w:color="CCCCCC" w:sz="1"/>
+              <w:left w:val="single" w:color="CCCCCC" w:sz="1"/>
+              <w:bottom w:val="single" w:color="CCCCCC" w:sz="1"/>
+              <w:right w:val="single" w:color="CCCCCC" w:sz="1"/>
+            </w:tcBorders>
+            <w:shd w:fill="FFFFFF" w:val="clear"/>
+            <w:tcMar>
+              <w:top w:type="dxa" w:w="80"/>
+              <w:left w:type="dxa" w:w="120"/>
+              <w:bottom w:type="dxa" w:w="80"/>
+              <w:right w:type="dxa" w:w="120"/>
+            </w:tcMar>
+          </w:tcPr>
+          <w:p>
+            <w:r>
+              <w:rPr>
+                <w:rFonts w:ascii="Arial" w:cs="Arial" w:eastAsia="Arial" w:hAnsi="Arial"/>
+                <w:b w:val="false"/>
+                <w:bCs w:val="false"/>
+                <w:sz w:val="18"/>
+                <w:szCs w:val="18"/>
+              </w:rPr>
+              <w:t xml:space="preserve">VaR and ES for stocks and European options is the explicit course project requirement; the model scope is a direct match</w:t>
+            </w:r>
+          </w:p>
+        </w:tc>
+      </w:tr>
+      <w:tr>
+        <w:tc>
+          <w:tcPr>
+            <w:tcW w:type="dxa" w:w="3900"/>
+            <w:tcBorders>
+              <w:top w:val="single" w:color="CCCCCC" w:sz="1"/>
+              <w:left w:val="single" w:color="CCCCCC" w:sz="1"/>
+              <w:bottom w:val="single" w:color="CCCCCC" w:sz="1"/>
+              <w:right w:val="single" w:color="CCCCCC" w:sz="1"/>
+            </w:tcBorders>
+            <w:shd w:fill="FFFFFF" w:val="clear"/>
+            <w:tcMar>
+              <w:top w:type="dxa" w:w="80"/>
+              <w:left w:type="dxa" w:w="120"/>
+              <w:bottom w:type="dxa" w:w="80"/>
+              <w:right w:type="dxa" w:w="120"/>
+            </w:tcMar>
+          </w:tcPr>
+          <w:p>
+            <w:r>
+              <w:rPr>
+                <w:rFonts w:ascii="Arial" w:cs="Arial" w:eastAsia="Arial" w:hAnsi="Arial"/>
+                <w:b w:val="false"/>
+                <w:bCs w:val="false"/>
+                <w:sz w:val="18"/>
+                <w:szCs w:val="18"/>
+              </w:rPr>
+              <w:t xml:space="preserve">Mathematical specification documented</w:t>
+            </w:r>
+          </w:p>
+        </w:tc>
+        <w:tc>
+          <w:tcPr>
+            <w:tcW w:type="dxa" w:w="5460"/>
+            <w:tcBorders>
+              <w:top w:val="single" w:color="CCCCCC" w:sz="1"/>
+              <w:left w:val="single" w:color="CCCCCC" w:sz="1"/>
+              <w:bottom w:val="single" w:color="CCCCCC" w:sz="1"/>
+              <w:right w:val="single" w:color="CCCCCC" w:sz="1"/>
+            </w:tcBorders>
+            <w:shd w:fill="FFFFFF" w:val="clear"/>
+            <w:tcMar>
+              <w:top w:type="dxa" w:w="80"/>
+              <w:left w:type="dxa" w:w="120"/>
+              <w:bottom w:type="dxa" w:w="80"/>
+              <w:right w:type="dxa" w:w="120"/>
+            </w:tcMar>
+          </w:tcPr>
+          <w:p>
+            <w:r>
+              <w:rPr>
+                <w:rFonts w:ascii="Arial" w:cs="Arial" w:eastAsia="Arial" w:hAnsi="Arial"/>
+                <w:b w:val="false"/>
+                <w:bCs w:val="false"/>
+                <w:sz w:val="18"/>
+                <w:szCs w:val="18"/>
+              </w:rPr>
+              <w:t xml:space="preserve">Formula sheet and model description with explicit formulae for all methods</w:t>
+            </w:r>
+          </w:p>
+        </w:tc>
+      </w:tr>
+      <w:tr>
+        <w:tc>
+          <w:tcPr>
+            <w:tcW w:type="dxa" w:w="3900"/>
+            <w:tcBorders>
+              <w:top w:val="single" w:color="CCCCCC" w:sz="1"/>
+              <w:left w:val="single" w:color="CCCCCC" w:sz="1"/>
+              <w:bottom w:val="single" w:color="CCCCCC" w:sz="1"/>
+              <w:right w:val="single" w:color="CCCCCC" w:sz="1"/>
+            </w:tcBorders>
+            <w:shd w:fill="FFFFFF" w:val="clear"/>
+            <w:tcMar>
+              <w:top w:type="dxa" w:w="80"/>
+              <w:left w:type="dxa" w:w="120"/>
+              <w:bottom w:type="dxa" w:w="80"/>
+              <w:right w:type="dxa" w:w="120"/>
+            </w:tcMar>
+          </w:tcPr>
+          <w:p>
+            <w:r>
+              <w:rPr>
+                <w:rFonts w:ascii="Arial" w:cs="Arial" w:eastAsia="Arial" w:hAnsi="Arial"/>
+                <w:b w:val="false"/>
+                <w:bCs w:val="false"/>
+                <w:sz w:val="18"/>
+                <w:szCs w:val="18"/>
+              </w:rPr>
+              <w:t xml:space="preserve">Alternative approaches considered</w:t>
+            </w:r>
+          </w:p>
+        </w:tc>
+        <w:tc>
+          <w:tcPr>
+            <w:tcW w:type="dxa" w:w="5460"/>
+            <w:tcBorders>
+              <w:top w:val="single" w:color="CCCCCC" w:sz="1"/>
+              <w:left w:val="single" w:color="CCCCCC" w:sz="1"/>
+              <w:bottom w:val="single" w:color="CCCCCC" w:sz="1"/>
+              <w:right w:val="single" w:color="CCCCCC" w:sz="1"/>
+            </w:tcBorders>
+            <w:shd w:fill="FFFFFF" w:val="clear"/>
+            <w:tcMar>
+              <w:top w:type="dxa" w:w="80"/>
+              <w:left w:type="dxa" w:w="120"/>
+              <w:bottom w:type="dxa" w:w="80"/>
+              <w:right w:type="dxa" w:w="120"/>
+            </w:tcMar>
+          </w:tcPr>
+          <w:p>
+            <w:r>
+              <w:rPr>
+                <w:rFonts w:ascii="Arial" w:cs="Arial" w:eastAsia="Arial" w:hAnsi="Arial"/>
+                <w:b w:val="false"/>
+                <w:bCs w:val="false"/>
+                <w:sz w:val="18"/>
+                <w:szCs w:val="18"/>
+              </w:rPr>
+              <w:t xml:space="preserve">Historical vs parametric vs Monte Carlo comparison in §3.2; estimator comparison notebooks</w:t>
+            </w:r>
+          </w:p>
+        </w:tc>
+      </w:tr>
+      <w:tr>
+        <w:tc>
+          <w:tcPr>
+            <w:tcW w:type="dxa" w:w="3900"/>
+            <w:tcBorders>
+              <w:top w:val="single" w:color="CCCCCC" w:sz="1"/>
+              <w:left w:val="single" w:color="CCCCCC" w:sz="1"/>
+              <w:bottom w:val="single" w:color="CCCCCC" w:sz="1"/>
+              <w:right w:val="single" w:color="CCCCCC" w:sz="1"/>
+            </w:tcBorders>
+            <w:shd w:fill="FFFFFF" w:val="clear"/>
+            <w:tcMar>
+              <w:top w:type="dxa" w:w="80"/>
+              <w:left w:type="dxa" w:w="120"/>
+              <w:bottom w:type="dxa" w:w="80"/>
+              <w:right w:type="dxa" w:w="120"/>
+            </w:tcMar>
+          </w:tcPr>
+          <w:p>
+            <w:r>
+              <w:rPr>
+                <w:rFonts w:ascii="Arial" w:cs="Arial" w:eastAsia="Arial" w:hAnsi="Arial"/>
+                <w:b w:val="false"/>
+                <w:bCs w:val="false"/>
+                <w:sz w:val="18"/>
+                <w:szCs w:val="18"/>
+              </w:rPr>
+              <w:t xml:space="preserve">Assumptions documented</w:t>
+            </w:r>
+          </w:p>
+        </w:tc>
+        <w:tc>
+          <w:tcPr>
+            <w:tcW w:type="dxa" w:w="5460"/>
+            <w:tcBorders>
+              <w:top w:val="single" w:color="CCCCCC" w:sz="1"/>
+              <w:left w:val="single" w:color="CCCCCC" w:sz="1"/>
+              <w:bottom w:val="single" w:color="CCCCCC" w:sz="1"/>
+              <w:right w:val="single" w:color="CCCCCC" w:sz="1"/>
+            </w:tcBorders>
+            <w:shd w:fill="FFFFFF" w:val="clear"/>
+            <w:tcMar>
+              <w:top w:type="dxa" w:w="80"/>
+              <w:left w:type="dxa" w:w="120"/>
+              <w:bottom w:type="dxa" w:w="80"/>
+              <w:right w:type="dxa" w:w="120"/>
+            </w:tcMar>
+          </w:tcPr>
+          <w:p>
+            <w:r>
+              <w:rPr>
+                <w:rFonts w:ascii="Arial" w:cs="Arial" w:eastAsia="Arial" w:hAnsi="Arial"/>
+                <w:b w:val="false"/>
+                <w:bCs w:val="false"/>
+                <w:sz w:val="18"/>
+                <w:szCs w:val="18"/>
+              </w:rPr>
+              <w:t xml:space="preserve">Lognormal returns (GBM), multivariate normal simulation, Black-Scholes constant volatility, covariance stationarity — all documented in §6 and §10</w:t>
+            </w:r>
+          </w:p>
+        </w:tc>
+      </w:tr>
+      <w:tr>
+        <w:tc>
+          <w:tcPr>
+            <w:tcW w:type="dxa" w:w="3900"/>
+            <w:tcBorders>
+              <w:top w:val="single" w:color="CCCCCC" w:sz="1"/>
+              <w:left w:val="single" w:color="CCCCCC" w:sz="1"/>
+              <w:bottom w:val="single" w:color="CCCCCC" w:sz="1"/>
+              <w:right w:val="single" w:color="CCCCCC" w:sz="1"/>
+            </w:tcBorders>
+            <w:shd w:fill="FFFFFF" w:val="clear"/>
+            <w:tcMar>
+              <w:top w:type="dxa" w:w="80"/>
+              <w:left w:type="dxa" w:w="120"/>
+              <w:bottom w:type="dxa" w:w="80"/>
+              <w:right w:type="dxa" w:w="120"/>
+            </w:tcMar>
+          </w:tcPr>
+          <w:p>
+            <w:r>
+              <w:rPr>
+                <w:rFonts w:ascii="Arial" w:cs="Arial" w:eastAsia="Arial" w:hAnsi="Arial"/>
+                <w:b w:val="false"/>
+                <w:bCs w:val="false"/>
+                <w:sz w:val="18"/>
+                <w:szCs w:val="18"/>
+              </w:rPr>
+              <w:t xml:space="preserve">Sensitivity analysis performed</w:t>
+            </w:r>
+          </w:p>
+        </w:tc>
+        <w:tc>
+          <w:tcPr>
+            <w:tcW w:type="dxa" w:w="5460"/>
+            <w:tcBorders>
+              <w:top w:val="single" w:color="CCCCCC" w:sz="1"/>
+              <w:left w:val="single" w:color="CCCCCC" w:sz="1"/>
+              <w:bottom w:val="single" w:color="CCCCCC" w:sz="1"/>
+              <w:right w:val="single" w:color="CCCCCC" w:sz="1"/>
+            </w:tcBorders>
+            <w:shd w:fill="FFFFFF" w:val="clear"/>
+            <w:tcMar>
+              <w:top w:type="dxa" w:w="80"/>
+              <w:left w:type="dxa" w:w="120"/>
+              <w:bottom w:type="dxa" w:w="80"/>
+              <w:right w:type="dxa" w:w="120"/>
+            </w:tcMar>
+          </w:tcPr>
+          <w:p>
+            <w:r>
+              <w:rPr>
+                <w:rFonts w:ascii="Arial" w:cs="Arial" w:eastAsia="Arial" w:hAnsi="Arial"/>
+                <w:b w:val="false"/>
+                <w:bCs w:val="false"/>
+                <w:sz w:val="18"/>
+                <w:szCs w:val="18"/>
+              </w:rPr>
+              <w:t xml:space="preserve">Lookback window (252 days baseline), VaR/ES confidence (99%/97.5%), horizon (1 day), MC path count (10,000) — each configurable and tested</w:t>
+            </w:r>
+          </w:p>
+        </w:tc>
+      </w:tr>
+      <w:tr>
+        <w:tc>
+          <w:tcPr>
+            <w:tcW w:type="dxa" w:w="3900"/>
+            <w:tcBorders>
+              <w:top w:val="single" w:color="CCCCCC" w:sz="1"/>
+              <w:left w:val="single" w:color="CCCCCC" w:sz="1"/>
+              <w:bottom w:val="single" w:color="CCCCCC" w:sz="1"/>
+              <w:right w:val="single" w:color="CCCCCC" w:sz="1"/>
+            </w:tcBorders>
+            <w:shd w:fill="FFFFFF" w:val="clear"/>
+            <w:tcMar>
+              <w:top w:type="dxa" w:w="80"/>
+              <w:left w:type="dxa" w:w="120"/>
+              <w:bottom w:type="dxa" w:w="80"/>
+              <w:right w:type="dxa" w:w="120"/>
+            </w:tcMar>
+          </w:tcPr>
+          <w:p>
+            <w:r>
+              <w:rPr>
+                <w:rFonts w:ascii="Arial" w:cs="Arial" w:eastAsia="Arial" w:hAnsi="Arial"/>
+                <w:b w:val="false"/>
+                <w:bCs w:val="false"/>
+                <w:sz w:val="18"/>
+                <w:szCs w:val="18"/>
+              </w:rPr>
+              <w:t xml:space="preserve">Limitations documented</w:t>
+            </w:r>
+          </w:p>
+        </w:tc>
+        <w:tc>
+          <w:tcPr>
+            <w:tcW w:type="dxa" w:w="5460"/>
+            <w:tcBorders>
+              <w:top w:val="single" w:color="CCCCCC" w:sz="1"/>
+              <w:left w:val="single" w:color="CCCCCC" w:sz="1"/>
+              <w:bottom w:val="single" w:color="CCCCCC" w:sz="1"/>
+              <w:right w:val="single" w:color="CCCCCC" w:sz="1"/>
+            </w:tcBorders>
+            <w:shd w:fill="FFFFFF" w:val="clear"/>
+            <w:tcMar>
+              <w:top w:type="dxa" w:w="80"/>
+              <w:left w:type="dxa" w:w="120"/>
+              <w:bottom w:type="dxa" w:w="80"/>
+              <w:right w:type="dxa" w:w="120"/>
+            </w:tcMar>
+          </w:tcPr>
+          <w:p>
+            <w:r>
+              <w:rPr>
+                <w:rFonts w:ascii="Arial" w:cs="Arial" w:eastAsia="Arial" w:hAnsi="Arial"/>
+                <w:b w:val="false"/>
+                <w:bCs w:val="false"/>
+                <w:sz w:val="18"/>
+                <w:szCs w:val="18"/>
+              </w:rPr>
+              <w:t xml:space="preserve">§10 Limitations table; option vega risk, delta-normal gamma approximation, multivariate normality, data quality — all listed explicitly</w:t>
+            </w:r>
+          </w:p>
+        </w:tc>
+      </w:tr>
+    </w:tbl>
+    <w:p/>
+    <w:p>
+      <w:pPr>
+        <w:pStyle w:val="Heading2"/>
+        <w:spacing w:after="120" w:before="240"/>
+      </w:pPr>
+      <w:r>
+        <w:rPr>
+          <w:rFonts w:ascii="Arial" w:cs="Arial" w:eastAsia="Arial" w:hAnsi="Arial"/>
+          <w:b/>
+          <w:bCs/>
+          <w:color w:val="2E75B6"/>
+          <w:sz w:val="26"/>
+          <w:szCs w:val="26"/>
+        </w:rPr>
+        <w:t xml:space="preserve">3.5  Ongoing Monitoring and Post-Deployment</w:t>
+      </w:r>
+    </w:p>
+    <w:p>
+      <w:pPr>
+        <w:spacing w:after="80" w:before="80"/>
+      </w:pPr>
+      <w:r>
+        <w:rPr>
+          <w:rFonts w:ascii="Arial" w:cs="Arial" w:eastAsia="Arial" w:hAnsi="Arial"/>
+          <w:sz w:val="22"/>
+          <w:szCs w:val="22"/>
+        </w:rPr>
+        <w:t xml:space="preserve">Lecture 5 states that after deployment, teams should obtain user feedback, confirm reports are clear and indicate uncertainty appropriately, and ensure users understand model limitations. Changes must be justified, logged, tested, and revalidated based on materiality.</w:t>
+      </w:r>
+    </w:p>
+    <w:tbl>
+      <w:tblPr>
+        <w:tblW w:type="dxa" w:w="9360"/>
+        <w:tblBorders>
+          <w:top w:val="single" w:color="auto" w:sz="4"/>
+          <w:left w:val="single" w:color="auto" w:sz="4"/>
+          <w:bottom w:val="single" w:color="auto" w:sz="4"/>
+          <w:right w:val="single" w:color="auto" w:sz="4"/>
+          <w:insideH w:val="single" w:color="auto" w:sz="4"/>
+          <w:insideV w:val="single" w:color="auto" w:sz="4"/>
+        </w:tblBorders>
+      </w:tblPr>
+      <w:tblGrid>
+        <w:gridCol w:w="3120"/>
+        <w:gridCol w:w="6240"/>
+      </w:tblGrid>
+      <w:tr>
+        <w:trPr>
+          <w:tblHeader/>
+        </w:trPr>
+        <w:tc>
+          <w:tcPr>
+            <w:tcW w:type="dxa" w:w="3120"/>
+            <w:tcBorders>
+              <w:top w:val="single" w:color="CCCCCC" w:sz="1"/>
+              <w:left w:val="single" w:color="CCCCCC" w:sz="1"/>
+              <w:bottom w:val="single" w:color="CCCCCC" w:sz="1"/>
+              <w:right w:val="single" w:color="CCCCCC" w:sz="1"/>
+            </w:tcBorders>
+            <w:shd w:fill="D5E8F0" w:val="clear"/>
+            <w:tcMar>
+              <w:top w:type="dxa" w:w="80"/>
+              <w:left w:type="dxa" w:w="120"/>
+              <w:bottom w:type="dxa" w:w="80"/>
+              <w:right w:type="dxa" w:w="120"/>
+            </w:tcMar>
+          </w:tcPr>
+          <w:p>
+            <w:r>
+              <w:rPr>
+                <w:rFonts w:ascii="Arial" w:cs="Arial" w:eastAsia="Arial" w:hAnsi="Arial"/>
+                <w:b/>
+                <w:bCs/>
+                <w:sz w:val="18"/>
+                <w:szCs w:val="18"/>
+              </w:rPr>
+              <w:t xml:space="preserve">Monitoring item</w:t>
+            </w:r>
+          </w:p>
+        </w:tc>
+        <w:tc>
+          <w:tcPr>
+            <w:tcW w:type="dxa" w:w="6240"/>
+            <w:tcBorders>
+              <w:top w:val="single" w:color="CCCCCC" w:sz="1"/>
+              <w:left w:val="single" w:color="CCCCCC" w:sz="1"/>
+              <w:bottom w:val="single" w:color="CCCCCC" w:sz="1"/>
+              <w:right w:val="single" w:color="CCCCCC" w:sz="1"/>
+            </w:tcBorders>
+            <w:shd w:fill="D5E8F0" w:val="clear"/>
+            <w:tcMar>
+              <w:top w:type="dxa" w:w="80"/>
+              <w:left w:type="dxa" w:w="120"/>
+              <w:bottom w:type="dxa" w:w="80"/>
+              <w:right w:type="dxa" w:w="120"/>
+            </w:tcMar>
+          </w:tcPr>
+          <w:p>
+            <w:r>
+              <w:rPr>
+                <w:rFonts w:ascii="Arial" w:cs="Arial" w:eastAsia="Arial" w:hAnsi="Arial"/>
+                <w:b/>
+                <w:bCs/>
+                <w:sz w:val="18"/>
+                <w:szCs w:val="18"/>
+              </w:rPr>
+              <w:t xml:space="preserve">Proposed action</w:t>
+            </w:r>
+          </w:p>
+        </w:tc>
+      </w:tr>
+      <w:tr>
+        <w:tc>
+          <w:tcPr>
+            <w:tcW w:type="dxa" w:w="3120"/>
+            <w:tcBorders>
+              <w:top w:val="single" w:color="CCCCCC" w:sz="1"/>
+              <w:left w:val="single" w:color="CCCCCC" w:sz="1"/>
+              <w:bottom w:val="single" w:color="CCCCCC" w:sz="1"/>
+              <w:right w:val="single" w:color="CCCCCC" w:sz="1"/>
+            </w:tcBorders>
+            <w:shd w:fill="FFFFFF" w:val="clear"/>
+            <w:tcMar>
+              <w:top w:type="dxa" w:w="80"/>
+              <w:left w:type="dxa" w:w="120"/>
+              <w:bottom w:type="dxa" w:w="80"/>
+              <w:right w:type="dxa" w:w="120"/>
+            </w:tcMar>
+          </w:tcPr>
+          <w:p>
+            <w:r>
+              <w:rPr>
+                <w:rFonts w:ascii="Arial" w:cs="Arial" w:eastAsia="Arial" w:hAnsi="Arial"/>
+                <w:b w:val="false"/>
+                <w:bCs w:val="false"/>
+                <w:sz w:val="18"/>
+                <w:szCs w:val="18"/>
+              </w:rPr>
+              <w:t xml:space="preserve">Daily / periodic VaR exceptions</w:t>
+            </w:r>
+          </w:p>
+        </w:tc>
+        <w:tc>
+          <w:tcPr>
+            <w:tcW w:type="dxa" w:w="6240"/>
+            <w:tcBorders>
+              <w:top w:val="single" w:color="CCCCCC" w:sz="1"/>
+              <w:left w:val="single" w:color="CCCCCC" w:sz="1"/>
+              <w:bottom w:val="single" w:color="CCCCCC" w:sz="1"/>
+              <w:right w:val="single" w:color="CCCCCC" w:sz="1"/>
+            </w:tcBorders>
+            <w:shd w:fill="FFFFFF" w:val="clear"/>
+            <w:tcMar>
+              <w:top w:type="dxa" w:w="80"/>
+              <w:left w:type="dxa" w:w="120"/>
+              <w:bottom w:type="dxa" w:w="80"/>
+              <w:right w:type="dxa" w:w="120"/>
+            </w:tcMar>
+          </w:tcPr>
+          <w:p>
+            <w:r>
+              <w:rPr>
+                <w:rFonts w:ascii="Arial" w:cs="Arial" w:eastAsia="Arial" w:hAnsi="Arial"/>
+                <w:b w:val="false"/>
+                <w:bCs w:val="false"/>
+                <w:sz w:val="18"/>
+                <w:szCs w:val="18"/>
+              </w:rPr>
+              <w:t xml:space="preserve">Track exception rate and clustering; re-run Kupiec and Christoffersen tests periodically</w:t>
+            </w:r>
+          </w:p>
+        </w:tc>
+      </w:tr>
+      <w:tr>
+        <w:tc>
+          <w:tcPr>
+            <w:tcW w:type="dxa" w:w="3120"/>
+            <w:tcBorders>
+              <w:top w:val="single" w:color="CCCCCC" w:sz="1"/>
+              <w:left w:val="single" w:color="CCCCCC" w:sz="1"/>
+              <w:bottom w:val="single" w:color="CCCCCC" w:sz="1"/>
+              <w:right w:val="single" w:color="CCCCCC" w:sz="1"/>
+            </w:tcBorders>
+            <w:shd w:fill="FFFFFF" w:val="clear"/>
+            <w:tcMar>
+              <w:top w:type="dxa" w:w="80"/>
+              <w:left w:type="dxa" w:w="120"/>
+              <w:bottom w:type="dxa" w:w="80"/>
+              <w:right w:type="dxa" w:w="120"/>
+            </w:tcMar>
+          </w:tcPr>
+          <w:p>
+            <w:r>
+              <w:rPr>
+                <w:rFonts w:ascii="Arial" w:cs="Arial" w:eastAsia="Arial" w:hAnsi="Arial"/>
+                <w:b w:val="false"/>
+                <w:bCs w:val="false"/>
+                <w:sz w:val="18"/>
+                <w:szCs w:val="18"/>
+              </w:rPr>
+              <w:t xml:space="preserve">Input drift</w:t>
+            </w:r>
+          </w:p>
+        </w:tc>
+        <w:tc>
+          <w:tcPr>
+            <w:tcW w:type="dxa" w:w="6240"/>
+            <w:tcBorders>
+              <w:top w:val="single" w:color="CCCCCC" w:sz="1"/>
+              <w:left w:val="single" w:color="CCCCCC" w:sz="1"/>
+              <w:bottom w:val="single" w:color="CCCCCC" w:sz="1"/>
+              <w:right w:val="single" w:color="CCCCCC" w:sz="1"/>
+            </w:tcBorders>
+            <w:shd w:fill="FFFFFF" w:val="clear"/>
+            <w:tcMar>
+              <w:top w:type="dxa" w:w="80"/>
+              <w:left w:type="dxa" w:w="120"/>
+              <w:bottom w:type="dxa" w:w="80"/>
+              <w:right w:type="dxa" w:w="120"/>
+            </w:tcMar>
+          </w:tcPr>
+          <w:p>
+            <w:r>
+              <w:rPr>
+                <w:rFonts w:ascii="Arial" w:cs="Arial" w:eastAsia="Arial" w:hAnsi="Arial"/>
+                <w:b w:val="false"/>
+                <w:bCs w:val="false"/>
+                <w:sz w:val="18"/>
+                <w:szCs w:val="18"/>
+              </w:rPr>
+              <w:t xml:space="preserve">Monitor volatility level, covariance structure, and return outliers across the lookback window</w:t>
+            </w:r>
+          </w:p>
+        </w:tc>
+      </w:tr>
+      <w:tr>
+        <w:tc>
+          <w:tcPr>
+            <w:tcW w:type="dxa" w:w="3120"/>
+            <w:tcBorders>
+              <w:top w:val="single" w:color="CCCCCC" w:sz="1"/>
+              <w:left w:val="single" w:color="CCCCCC" w:sz="1"/>
+              <w:bottom w:val="single" w:color="CCCCCC" w:sz="1"/>
+              <w:right w:val="single" w:color="CCCCCC" w:sz="1"/>
+            </w:tcBorders>
+            <w:shd w:fill="FFFFFF" w:val="clear"/>
+            <w:tcMar>
+              <w:top w:type="dxa" w:w="80"/>
+              <w:left w:type="dxa" w:w="120"/>
+              <w:bottom w:type="dxa" w:w="80"/>
+              <w:right w:type="dxa" w:w="120"/>
+            </w:tcMar>
+          </w:tcPr>
+          <w:p>
+            <w:r>
+              <w:rPr>
+                <w:rFonts w:ascii="Arial" w:cs="Arial" w:eastAsia="Arial" w:hAnsi="Arial"/>
+                <w:b w:val="false"/>
+                <w:bCs w:val="false"/>
+                <w:sz w:val="18"/>
+                <w:szCs w:val="18"/>
+              </w:rPr>
+              <w:t xml:space="preserve">Data quality</w:t>
+            </w:r>
+          </w:p>
+        </w:tc>
+        <w:tc>
+          <w:tcPr>
+            <w:tcW w:type="dxa" w:w="6240"/>
+            <w:tcBorders>
+              <w:top w:val="single" w:color="CCCCCC" w:sz="1"/>
+              <w:left w:val="single" w:color="CCCCCC" w:sz="1"/>
+              <w:bottom w:val="single" w:color="CCCCCC" w:sz="1"/>
+              <w:right w:val="single" w:color="CCCCCC" w:sz="1"/>
+            </w:tcBorders>
+            <w:shd w:fill="FFFFFF" w:val="clear"/>
+            <w:tcMar>
+              <w:top w:type="dxa" w:w="80"/>
+              <w:left w:type="dxa" w:w="120"/>
+              <w:bottom w:type="dxa" w:w="80"/>
+              <w:right w:type="dxa" w:w="120"/>
+            </w:tcMar>
+          </w:tcPr>
+          <w:p>
+            <w:r>
+              <w:rPr>
+                <w:rFonts w:ascii="Arial" w:cs="Arial" w:eastAsia="Arial" w:hAnsi="Arial"/>
+                <w:b w:val="false"/>
+                <w:bCs w:val="false"/>
+                <w:sz w:val="18"/>
+                <w:szCs w:val="18"/>
+              </w:rPr>
+              <w:t xml:space="preserve">Detect missing or stale prices and ticker mismatches at each data load</w:t>
+            </w:r>
+          </w:p>
+        </w:tc>
+      </w:tr>
+      <w:tr>
+        <w:tc>
+          <w:tcPr>
+            <w:tcW w:type="dxa" w:w="3120"/>
+            <w:tcBorders>
+              <w:top w:val="single" w:color="CCCCCC" w:sz="1"/>
+              <w:left w:val="single" w:color="CCCCCC" w:sz="1"/>
+              <w:bottom w:val="single" w:color="CCCCCC" w:sz="1"/>
+              <w:right w:val="single" w:color="CCCCCC" w:sz="1"/>
+            </w:tcBorders>
+            <w:shd w:fill="FFFFFF" w:val="clear"/>
+            <w:tcMar>
+              <w:top w:type="dxa" w:w="80"/>
+              <w:left w:type="dxa" w:w="120"/>
+              <w:bottom w:type="dxa" w:w="80"/>
+              <w:right w:type="dxa" w:w="120"/>
+            </w:tcMar>
+          </w:tcPr>
+          <w:p>
+            <w:r>
+              <w:rPr>
+                <w:rFonts w:ascii="Arial" w:cs="Arial" w:eastAsia="Arial" w:hAnsi="Arial"/>
+                <w:b w:val="false"/>
+                <w:bCs w:val="false"/>
+                <w:sz w:val="18"/>
+                <w:szCs w:val="18"/>
+              </w:rPr>
+              <w:t xml:space="preserve">Model code changes</w:t>
+            </w:r>
+          </w:p>
+        </w:tc>
+        <w:tc>
+          <w:tcPr>
+            <w:tcW w:type="dxa" w:w="6240"/>
+            <w:tcBorders>
+              <w:top w:val="single" w:color="CCCCCC" w:sz="1"/>
+              <w:left w:val="single" w:color="CCCCCC" w:sz="1"/>
+              <w:bottom w:val="single" w:color="CCCCCC" w:sz="1"/>
+              <w:right w:val="single" w:color="CCCCCC" w:sz="1"/>
+            </w:tcBorders>
+            <w:shd w:fill="FFFFFF" w:val="clear"/>
+            <w:tcMar>
+              <w:top w:type="dxa" w:w="80"/>
+              <w:left w:type="dxa" w:w="120"/>
+              <w:bottom w:type="dxa" w:w="80"/>
+              <w:right w:type="dxa" w:w="120"/>
+            </w:tcMar>
+          </w:tcPr>
+          <w:p>
+            <w:r>
+              <w:rPr>
+                <w:rFonts w:ascii="Arial" w:cs="Arial" w:eastAsia="Arial" w:hAnsi="Arial"/>
+                <w:b w:val="false"/>
+                <w:bCs w:val="false"/>
+                <w:sz w:val="18"/>
+                <w:szCs w:val="18"/>
+              </w:rPr>
+              <w:t xml:space="preserve">Log all code and model changes; rerun full regression test suite (pytest tests/) after every change</w:t>
+            </w:r>
+          </w:p>
+        </w:tc>
+      </w:tr>
+      <w:tr>
+        <w:tc>
+          <w:tcPr>
+            <w:tcW w:type="dxa" w:w="3120"/>
+            <w:tcBorders>
+              <w:top w:val="single" w:color="CCCCCC" w:sz="1"/>
+              <w:left w:val="single" w:color="CCCCCC" w:sz="1"/>
+              <w:bottom w:val="single" w:color="CCCCCC" w:sz="1"/>
+              <w:right w:val="single" w:color="CCCCCC" w:sz="1"/>
+            </w:tcBorders>
+            <w:shd w:fill="FFFFFF" w:val="clear"/>
+            <w:tcMar>
+              <w:top w:type="dxa" w:w="80"/>
+              <w:left w:type="dxa" w:w="120"/>
+              <w:bottom w:type="dxa" w:w="80"/>
+              <w:right w:type="dxa" w:w="120"/>
+            </w:tcMar>
+          </w:tcPr>
+          <w:p>
+            <w:r>
+              <w:rPr>
+                <w:rFonts w:ascii="Arial" w:cs="Arial" w:eastAsia="Arial" w:hAnsi="Arial"/>
+                <w:b w:val="false"/>
+                <w:bCs w:val="false"/>
+                <w:sz w:val="18"/>
+                <w:szCs w:val="18"/>
+              </w:rPr>
+              <w:t xml:space="preserve">User parameter overrides</w:t>
+            </w:r>
+          </w:p>
+        </w:tc>
+        <w:tc>
+          <w:tcPr>
+            <w:tcW w:type="dxa" w:w="6240"/>
+            <w:tcBorders>
+              <w:top w:val="single" w:color="CCCCCC" w:sz="1"/>
+              <w:left w:val="single" w:color="CCCCCC" w:sz="1"/>
+              <w:bottom w:val="single" w:color="CCCCCC" w:sz="1"/>
+              <w:right w:val="single" w:color="CCCCCC" w:sz="1"/>
+            </w:tcBorders>
+            <w:shd w:fill="FFFFFF" w:val="clear"/>
+            <w:tcMar>
+              <w:top w:type="dxa" w:w="80"/>
+              <w:left w:type="dxa" w:w="120"/>
+              <w:bottom w:type="dxa" w:w="80"/>
+              <w:right w:type="dxa" w:w="120"/>
+            </w:tcMar>
+          </w:tcPr>
+          <w:p>
+            <w:r>
+              <w:rPr>
+                <w:rFonts w:ascii="Arial" w:cs="Arial" w:eastAsia="Arial" w:hAnsi="Arial"/>
+                <w:b w:val="false"/>
+                <w:bCs w:val="false"/>
+                <w:sz w:val="18"/>
+                <w:szCs w:val="18"/>
+              </w:rPr>
+              <w:t xml:space="preserve">Document any manual override of lookback, horizon, confidence, or volatility inputs</w:t>
+            </w:r>
+          </w:p>
+        </w:tc>
+      </w:tr>
+      <w:tr>
+        <w:tc>
+          <w:tcPr>
+            <w:tcW w:type="dxa" w:w="3120"/>
+            <w:tcBorders>
+              <w:top w:val="single" w:color="CCCCCC" w:sz="1"/>
+              <w:left w:val="single" w:color="CCCCCC" w:sz="1"/>
+              <w:bottom w:val="single" w:color="CCCCCC" w:sz="1"/>
+              <w:right w:val="single" w:color="CCCCCC" w:sz="1"/>
+            </w:tcBorders>
+            <w:shd w:fill="FFFFFF" w:val="clear"/>
+            <w:tcMar>
+              <w:top w:type="dxa" w:w="80"/>
+              <w:left w:type="dxa" w:w="120"/>
+              <w:bottom w:type="dxa" w:w="80"/>
+              <w:right w:type="dxa" w:w="120"/>
+            </w:tcMar>
+          </w:tcPr>
+          <w:p>
+            <w:r>
+              <w:rPr>
+                <w:rFonts w:ascii="Arial" w:cs="Arial" w:eastAsia="Arial" w:hAnsi="Arial"/>
+                <w:b w:val="false"/>
+                <w:bCs w:val="false"/>
+                <w:sz w:val="18"/>
+                <w:szCs w:val="18"/>
+              </w:rPr>
+              <w:t xml:space="preserve">New instruments</w:t>
+            </w:r>
+          </w:p>
+        </w:tc>
+        <w:tc>
+          <w:tcPr>
+            <w:tcW w:type="dxa" w:w="6240"/>
+            <w:tcBorders>
+              <w:top w:val="single" w:color="CCCCCC" w:sz="1"/>
+              <w:left w:val="single" w:color="CCCCCC" w:sz="1"/>
+              <w:bottom w:val="single" w:color="CCCCCC" w:sz="1"/>
+              <w:right w:val="single" w:color="CCCCCC" w:sz="1"/>
+            </w:tcBorders>
+            <w:shd w:fill="FFFFFF" w:val="clear"/>
+            <w:tcMar>
+              <w:top w:type="dxa" w:w="80"/>
+              <w:left w:type="dxa" w:w="120"/>
+              <w:bottom w:type="dxa" w:w="80"/>
+              <w:right w:type="dxa" w:w="120"/>
+            </w:tcMar>
+          </w:tcPr>
+          <w:p>
+            <w:r>
+              <w:rPr>
+                <w:rFonts w:ascii="Arial" w:cs="Arial" w:eastAsia="Arial" w:hAnsi="Arial"/>
+                <w:b w:val="false"/>
+                <w:bCs w:val="false"/>
+                <w:sz w:val="18"/>
+                <w:szCs w:val="18"/>
+              </w:rPr>
+              <w:t xml:space="preserve">Require a model scope review and test extension before adding support for new instrument types</w:t>
+            </w:r>
+          </w:p>
+        </w:tc>
+      </w:tr>
+    </w:tbl>
+    <w:p>
+      <w:pPr>
+        <w:spacing w:after="80" w:before="80"/>
+      </w:pPr>
+      <w:r>
+        <w:rPr>
+          <w:rFonts w:ascii="Arial" w:cs="Arial" w:eastAsia="Arial" w:hAnsi="Arial"/>
+          <w:sz w:val="22"/>
+          <w:szCs w:val="22"/>
+        </w:rPr>
+        <w:t xml:space="preserve">Change management: Any material change to model methodology, pricing logic, data source, or risk measure definition should trigger revalidation. Small implementation changes (bug fixes, refactoring) require unit tests and peer review. Large methodology changes (new VaR method, new option pricing model, new credit module) require updated documentation, independent review, and full regression testing against existing fixtures.</w:t>
+      </w:r>
+    </w:p>
+    <w:p/>
+    <w:p>
+      <w:pPr>
+        <w:pStyle w:val="Heading2"/>
+        <w:spacing w:after="120" w:before="240"/>
+      </w:pPr>
+      <w:r>
+        <w:rPr>
+          <w:rFonts w:ascii="Arial" w:cs="Arial" w:eastAsia="Arial" w:hAnsi="Arial"/>
+          <w:b/>
+          <w:bCs/>
+          <w:color w:val="2E75B6"/>
+          <w:sz w:val="26"/>
+          <w:szCs w:val="26"/>
+        </w:rPr>
+        <w:t xml:space="preserve">3.6  Outcome Analysis and Backtesting</w:t>
+      </w:r>
+    </w:p>
+    <w:p>
+      <w:pPr>
+        <w:spacing w:after="80" w:before="80"/>
+      </w:pPr>
+      <w:r>
+        <w:rPr>
+          <w:rFonts w:ascii="Arial" w:cs="Arial" w:eastAsia="Arial" w:hAnsi="Arial"/>
+          <w:sz w:val="22"/>
+          <w:szCs w:val="22"/>
+        </w:rPr>
+        <w:t xml:space="preserve">Lecture 5 states that outcome analysis compares model outputs to actual outcomes. For VaR, this requires: confirming exception frequency against the expected rate, checking for exception clustering, testing across multiple confidence levels, and developing analogous tests for other risk measures.</w:t>
+      </w:r>
+    </w:p>
+    <w:p>
+      <w:pPr>
+        <w:spacing w:after="80" w:before="80"/>
+      </w:pPr>
+      <w:r>
+        <w:rPr>
+          <w:rFonts w:ascii="Arial" w:cs="Arial" w:eastAsia="Arial" w:hAnsi="Arial"/>
+          <w:sz w:val="22"/>
+          <w:szCs w:val="22"/>
+        </w:rPr>
+        <w:t xml:space="preserve">Key principle from Lecture 5: VaR backtesting is not optional. It is the model's primary outcome-analysis tool. It should be run regularly, at multiple confidence levels, and with clustering diagnostics.</w:t>
+      </w:r>
+    </w:p>
+    <w:tbl>
+      <w:tblPr>
+        <w:tblW w:type="dxa" w:w="9360"/>
+        <w:tblBorders>
+          <w:top w:val="single" w:color="auto" w:sz="4"/>
+          <w:left w:val="single" w:color="auto" w:sz="4"/>
+          <w:bottom w:val="single" w:color="auto" w:sz="4"/>
+          <w:right w:val="single" w:color="auto" w:sz="4"/>
+          <w:insideH w:val="single" w:color="auto" w:sz="4"/>
+          <w:insideV w:val="single" w:color="auto" w:sz="4"/>
+        </w:tblBorders>
+      </w:tblPr>
+      <w:tblGrid>
+        <w:gridCol w:w="3120"/>
+        <w:gridCol w:w="2080"/>
+        <w:gridCol w:w="4160"/>
+      </w:tblGrid>
+      <w:tr>
+        <w:trPr>
+          <w:tblHeader/>
+        </w:trPr>
+        <w:tc>
+          <w:tcPr>
+            <w:tcW w:type="dxa" w:w="3120"/>
+            <w:tcBorders>
+              <w:top w:val="single" w:color="CCCCCC" w:sz="1"/>
+              <w:left w:val="single" w:color="CCCCCC" w:sz="1"/>
+              <w:bottom w:val="single" w:color="CCCCCC" w:sz="1"/>
+              <w:right w:val="single" w:color="CCCCCC" w:sz="1"/>
+            </w:tcBorders>
+            <w:shd w:fill="D5E8F0" w:val="clear"/>
+            <w:tcMar>
+              <w:top w:type="dxa" w:w="80"/>
+              <w:left w:type="dxa" w:w="120"/>
+              <w:bottom w:type="dxa" w:w="80"/>
+              <w:right w:type="dxa" w:w="120"/>
+            </w:tcMar>
+          </w:tcPr>
+          <w:p>
+            <w:r>
+              <w:rPr>
+                <w:rFonts w:ascii="Arial" w:cs="Arial" w:eastAsia="Arial" w:hAnsi="Arial"/>
+                <w:b/>
+                <w:bCs/>
+                <w:sz w:val="18"/>
+                <w:szCs w:val="18"/>
+              </w:rPr>
+              <w:t xml:space="preserve">Backtest diagnostic</w:t>
+            </w:r>
+          </w:p>
+        </w:tc>
+        <w:tc>
+          <w:tcPr>
+            <w:tcW w:type="dxa" w:w="2080"/>
+            <w:tcBorders>
+              <w:top w:val="single" w:color="CCCCCC" w:sz="1"/>
+              <w:left w:val="single" w:color="CCCCCC" w:sz="1"/>
+              <w:bottom w:val="single" w:color="CCCCCC" w:sz="1"/>
+              <w:right w:val="single" w:color="CCCCCC" w:sz="1"/>
+            </w:tcBorders>
+            <w:shd w:fill="D5E8F0" w:val="clear"/>
+            <w:tcMar>
+              <w:top w:type="dxa" w:w="80"/>
+              <w:left w:type="dxa" w:w="120"/>
+              <w:bottom w:type="dxa" w:w="80"/>
+              <w:right w:type="dxa" w:w="120"/>
+            </w:tcMar>
+          </w:tcPr>
+          <w:p>
+            <w:r>
+              <w:rPr>
+                <w:rFonts w:ascii="Arial" w:cs="Arial" w:eastAsia="Arial" w:hAnsi="Arial"/>
+                <w:b/>
+                <w:bCs/>
+                <w:sz w:val="18"/>
+                <w:szCs w:val="18"/>
+              </w:rPr>
+              <w:t xml:space="preserve">Required?</w:t>
+            </w:r>
+          </w:p>
+        </w:tc>
+        <w:tc>
+          <w:tcPr>
+            <w:tcW w:type="dxa" w:w="4160"/>
+            <w:tcBorders>
+              <w:top w:val="single" w:color="CCCCCC" w:sz="1"/>
+              <w:left w:val="single" w:color="CCCCCC" w:sz="1"/>
+              <w:bottom w:val="single" w:color="CCCCCC" w:sz="1"/>
+              <w:right w:val="single" w:color="CCCCCC" w:sz="1"/>
+            </w:tcBorders>
+            <w:shd w:fill="D5E8F0" w:val="clear"/>
+            <w:tcMar>
+              <w:top w:type="dxa" w:w="80"/>
+              <w:left w:type="dxa" w:w="120"/>
+              <w:bottom w:type="dxa" w:w="80"/>
+              <w:right w:type="dxa" w:w="120"/>
+            </w:tcMar>
+          </w:tcPr>
+          <w:p>
+            <w:r>
+              <w:rPr>
+                <w:rFonts w:ascii="Arial" w:cs="Arial" w:eastAsia="Arial" w:hAnsi="Arial"/>
+                <w:b/>
+                <w:bCs/>
+                <w:sz w:val="18"/>
+                <w:szCs w:val="18"/>
+              </w:rPr>
+              <w:t xml:space="preserve">Status in this project</w:t>
+            </w:r>
+          </w:p>
+        </w:tc>
+      </w:tr>
+      <w:tr>
+        <w:tc>
+          <w:tcPr>
+            <w:tcW w:type="dxa" w:w="3120"/>
+            <w:tcBorders>
+              <w:top w:val="single" w:color="CCCCCC" w:sz="1"/>
+              <w:left w:val="single" w:color="CCCCCC" w:sz="1"/>
+              <w:bottom w:val="single" w:color="CCCCCC" w:sz="1"/>
+              <w:right w:val="single" w:color="CCCCCC" w:sz="1"/>
+            </w:tcBorders>
+            <w:shd w:fill="FFFFFF" w:val="clear"/>
+            <w:tcMar>
+              <w:top w:type="dxa" w:w="80"/>
+              <w:left w:type="dxa" w:w="120"/>
+              <w:bottom w:type="dxa" w:w="80"/>
+              <w:right w:type="dxa" w:w="120"/>
+            </w:tcMar>
+          </w:tcPr>
+          <w:p>
+            <w:r>
+              <w:rPr>
+                <w:rFonts w:ascii="Arial" w:cs="Arial" w:eastAsia="Arial" w:hAnsi="Arial"/>
+                <w:b w:val="false"/>
+                <w:bCs w:val="false"/>
+                <w:sz w:val="18"/>
+                <w:szCs w:val="18"/>
+              </w:rPr>
+              <w:t xml:space="preserve">Exception count</w:t>
+            </w:r>
+          </w:p>
+        </w:tc>
+        <w:tc>
+          <w:tcPr>
+            <w:tcW w:type="dxa" w:w="2080"/>
+            <w:tcBorders>
+              <w:top w:val="single" w:color="CCCCCC" w:sz="1"/>
+              <w:left w:val="single" w:color="CCCCCC" w:sz="1"/>
+              <w:bottom w:val="single" w:color="CCCCCC" w:sz="1"/>
+              <w:right w:val="single" w:color="CCCCCC" w:sz="1"/>
+            </w:tcBorders>
+            <w:shd w:fill="FFFFFF" w:val="clear"/>
+            <w:tcMar>
+              <w:top w:type="dxa" w:w="80"/>
+              <w:left w:type="dxa" w:w="120"/>
+              <w:bottom w:type="dxa" w:w="80"/>
+              <w:right w:type="dxa" w:w="120"/>
+            </w:tcMar>
+          </w:tcPr>
+          <w:p>
+            <w:r>
+              <w:rPr>
+                <w:rFonts w:ascii="Arial" w:cs="Arial" w:eastAsia="Arial" w:hAnsi="Arial"/>
+                <w:b w:val="false"/>
+                <w:bCs w:val="false"/>
+                <w:sz w:val="18"/>
+                <w:szCs w:val="18"/>
+              </w:rPr>
+              <w:t xml:space="preserve">Yes</w:t>
+            </w:r>
+          </w:p>
+        </w:tc>
+        <w:tc>
+          <w:tcPr>
+            <w:tcW w:type="dxa" w:w="4160"/>
+            <w:tcBorders>
+              <w:top w:val="single" w:color="CCCCCC" w:sz="1"/>
+              <w:left w:val="single" w:color="CCCCCC" w:sz="1"/>
+              <w:bottom w:val="single" w:color="CCCCCC" w:sz="1"/>
+              <w:right w:val="single" w:color="CCCCCC" w:sz="1"/>
+            </w:tcBorders>
+            <w:shd w:fill="FFFFFF" w:val="clear"/>
+            <w:tcMar>
+              <w:top w:type="dxa" w:w="80"/>
+              <w:left w:type="dxa" w:w="120"/>
+              <w:bottom w:type="dxa" w:w="80"/>
+              <w:right w:type="dxa" w:w="120"/>
+            </w:tcMar>
+          </w:tcPr>
+          <w:p>
+            <w:r>
+              <w:rPr>
+                <w:rFonts w:ascii="Arial" w:cs="Arial" w:eastAsia="Arial" w:hAnsi="Arial"/>
+                <w:b w:val="false"/>
+                <w:bCs w:val="false"/>
+                <w:sz w:val="18"/>
+                <w:szCs w:val="18"/>
+              </w:rPr>
+              <w:t xml:space="preserve">Implemented — 10 exceptions over 1,001 days</w:t>
+            </w:r>
+          </w:p>
+        </w:tc>
+      </w:tr>
+      <w:tr>
+        <w:tc>
+          <w:tcPr>
+            <w:tcW w:type="dxa" w:w="3120"/>
+            <w:tcBorders>
+              <w:top w:val="single" w:color="CCCCCC" w:sz="1"/>
+              <w:left w:val="single" w:color="CCCCCC" w:sz="1"/>
+              <w:bottom w:val="single" w:color="CCCCCC" w:sz="1"/>
+              <w:right w:val="single" w:color="CCCCCC" w:sz="1"/>
+            </w:tcBorders>
+            <w:shd w:fill="FFFFFF" w:val="clear"/>
+            <w:tcMar>
+              <w:top w:type="dxa" w:w="80"/>
+              <w:left w:type="dxa" w:w="120"/>
+              <w:bottom w:type="dxa" w:w="80"/>
+              <w:right w:type="dxa" w:w="120"/>
+            </w:tcMar>
+          </w:tcPr>
+          <w:p>
+            <w:r>
+              <w:rPr>
+                <w:rFonts w:ascii="Arial" w:cs="Arial" w:eastAsia="Arial" w:hAnsi="Arial"/>
+                <w:b w:val="false"/>
+                <w:bCs w:val="false"/>
+                <w:sz w:val="18"/>
+                <w:szCs w:val="18"/>
+              </w:rPr>
+              <w:t xml:space="preserve">Expected vs actual exception rate</w:t>
+            </w:r>
+          </w:p>
+        </w:tc>
+        <w:tc>
+          <w:tcPr>
+            <w:tcW w:type="dxa" w:w="2080"/>
+            <w:tcBorders>
+              <w:top w:val="single" w:color="CCCCCC" w:sz="1"/>
+              <w:left w:val="single" w:color="CCCCCC" w:sz="1"/>
+              <w:bottom w:val="single" w:color="CCCCCC" w:sz="1"/>
+              <w:right w:val="single" w:color="CCCCCC" w:sz="1"/>
+            </w:tcBorders>
+            <w:shd w:fill="FFFFFF" w:val="clear"/>
+            <w:tcMar>
+              <w:top w:type="dxa" w:w="80"/>
+              <w:left w:type="dxa" w:w="120"/>
+              <w:bottom w:type="dxa" w:w="80"/>
+              <w:right w:type="dxa" w:w="120"/>
+            </w:tcMar>
+          </w:tcPr>
+          <w:p>
+            <w:r>
+              <w:rPr>
+                <w:rFonts w:ascii="Arial" w:cs="Arial" w:eastAsia="Arial" w:hAnsi="Arial"/>
+                <w:b w:val="false"/>
+                <w:bCs w:val="false"/>
+                <w:sz w:val="18"/>
+                <w:szCs w:val="18"/>
+              </w:rPr>
+              <w:t xml:space="preserve">Yes</w:t>
+            </w:r>
+          </w:p>
+        </w:tc>
+        <w:tc>
+          <w:tcPr>
+            <w:tcW w:type="dxa" w:w="4160"/>
+            <w:tcBorders>
+              <w:top w:val="single" w:color="CCCCCC" w:sz="1"/>
+              <w:left w:val="single" w:color="CCCCCC" w:sz="1"/>
+              <w:bottom w:val="single" w:color="CCCCCC" w:sz="1"/>
+              <w:right w:val="single" w:color="CCCCCC" w:sz="1"/>
+            </w:tcBorders>
+            <w:shd w:fill="FFFFFF" w:val="clear"/>
+            <w:tcMar>
+              <w:top w:type="dxa" w:w="80"/>
+              <w:left w:type="dxa" w:w="120"/>
+              <w:bottom w:type="dxa" w:w="80"/>
+              <w:right w:type="dxa" w:w="120"/>
+            </w:tcMar>
+          </w:tcPr>
+          <w:p>
+            <w:r>
+              <w:rPr>
+                <w:rFonts w:ascii="Arial" w:cs="Arial" w:eastAsia="Arial" w:hAnsi="Arial"/>
+                <w:b w:val="false"/>
+                <w:bCs w:val="false"/>
+                <w:sz w:val="18"/>
+                <w:szCs w:val="18"/>
+              </w:rPr>
+              <w:t xml:space="preserve">Implemented — 1.00% observed vs 1.00% expected</w:t>
+            </w:r>
+          </w:p>
+        </w:tc>
+      </w:tr>
+      <w:tr>
+        <w:tc>
+          <w:tcPr>
+            <w:tcW w:type="dxa" w:w="3120"/>
+            <w:tcBorders>
+              <w:top w:val="single" w:color="CCCCCC" w:sz="1"/>
+              <w:left w:val="single" w:color="CCCCCC" w:sz="1"/>
+              <w:bottom w:val="single" w:color="CCCCCC" w:sz="1"/>
+              <w:right w:val="single" w:color="CCCCCC" w:sz="1"/>
+            </w:tcBorders>
+            <w:shd w:fill="FFFFFF" w:val="clear"/>
+            <w:tcMar>
+              <w:top w:type="dxa" w:w="80"/>
+              <w:left w:type="dxa" w:w="120"/>
+              <w:bottom w:type="dxa" w:w="80"/>
+              <w:right w:type="dxa" w:w="120"/>
+            </w:tcMar>
+          </w:tcPr>
+          <w:p>
+            <w:r>
+              <w:rPr>
+                <w:rFonts w:ascii="Arial" w:cs="Arial" w:eastAsia="Arial" w:hAnsi="Arial"/>
+                <w:b w:val="false"/>
+                <w:bCs w:val="false"/>
+                <w:sz w:val="18"/>
+                <w:szCs w:val="18"/>
+              </w:rPr>
+              <w:t xml:space="preserve">Kupiec unconditional coverage test</w:t>
+            </w:r>
+          </w:p>
+        </w:tc>
+        <w:tc>
+          <w:tcPr>
+            <w:tcW w:type="dxa" w:w="2080"/>
+            <w:tcBorders>
+              <w:top w:val="single" w:color="CCCCCC" w:sz="1"/>
+              <w:left w:val="single" w:color="CCCCCC" w:sz="1"/>
+              <w:bottom w:val="single" w:color="CCCCCC" w:sz="1"/>
+              <w:right w:val="single" w:color="CCCCCC" w:sz="1"/>
+            </w:tcBorders>
+            <w:shd w:fill="FFFFFF" w:val="clear"/>
+            <w:tcMar>
+              <w:top w:type="dxa" w:w="80"/>
+              <w:left w:type="dxa" w:w="120"/>
+              <w:bottom w:type="dxa" w:w="80"/>
+              <w:right w:type="dxa" w:w="120"/>
+            </w:tcMar>
+          </w:tcPr>
+          <w:p>
+            <w:r>
+              <w:rPr>
+                <w:rFonts w:ascii="Arial" w:cs="Arial" w:eastAsia="Arial" w:hAnsi="Arial"/>
+                <w:b w:val="false"/>
+                <w:bCs w:val="false"/>
+                <w:sz w:val="18"/>
+                <w:szCs w:val="18"/>
+              </w:rPr>
+              <w:t xml:space="preserve">Yes</w:t>
+            </w:r>
+          </w:p>
+        </w:tc>
+        <w:tc>
+          <w:tcPr>
+            <w:tcW w:type="dxa" w:w="4160"/>
+            <w:tcBorders>
+              <w:top w:val="single" w:color="CCCCCC" w:sz="1"/>
+              <w:left w:val="single" w:color="CCCCCC" w:sz="1"/>
+              <w:bottom w:val="single" w:color="CCCCCC" w:sz="1"/>
+              <w:right w:val="single" w:color="CCCCCC" w:sz="1"/>
+            </w:tcBorders>
+            <w:shd w:fill="FFFFFF" w:val="clear"/>
+            <w:tcMar>
+              <w:top w:type="dxa" w:w="80"/>
+              <w:left w:type="dxa" w:w="120"/>
+              <w:bottom w:type="dxa" w:w="80"/>
+              <w:right w:type="dxa" w:w="120"/>
+            </w:tcMar>
+          </w:tcPr>
+          <w:p>
+            <w:r>
+              <w:rPr>
+                <w:rFonts w:ascii="Arial" w:cs="Arial" w:eastAsia="Arial" w:hAnsi="Arial"/>
+                <w:b w:val="false"/>
+                <w:bCs w:val="false"/>
+                <w:sz w:val="18"/>
+                <w:szCs w:val="18"/>
+              </w:rPr>
+              <w:t xml:space="preserve">Implemented — LR = 0.0000, p = 0.9975, H0 not rejected</w:t>
+            </w:r>
+          </w:p>
+        </w:tc>
+      </w:tr>
+      <w:tr>
+        <w:tc>
+          <w:tcPr>
+            <w:tcW w:type="dxa" w:w="3120"/>
+            <w:tcBorders>
+              <w:top w:val="single" w:color="CCCCCC" w:sz="1"/>
+              <w:left w:val="single" w:color="CCCCCC" w:sz="1"/>
+              <w:bottom w:val="single" w:color="CCCCCC" w:sz="1"/>
+              <w:right w:val="single" w:color="CCCCCC" w:sz="1"/>
+            </w:tcBorders>
+            <w:shd w:fill="FFFFFF" w:val="clear"/>
+            <w:tcMar>
+              <w:top w:type="dxa" w:w="80"/>
+              <w:left w:type="dxa" w:w="120"/>
+              <w:bottom w:type="dxa" w:w="80"/>
+              <w:right w:type="dxa" w:w="120"/>
+            </w:tcMar>
+          </w:tcPr>
+          <w:p>
+            <w:r>
+              <w:rPr>
+                <w:rFonts w:ascii="Arial" w:cs="Arial" w:eastAsia="Arial" w:hAnsi="Arial"/>
+                <w:b w:val="false"/>
+                <w:bCs w:val="false"/>
+                <w:sz w:val="18"/>
+                <w:szCs w:val="18"/>
+              </w:rPr>
+              <w:t xml:space="preserve">Exception clustering (Christoffersen)</w:t>
+            </w:r>
+          </w:p>
+        </w:tc>
+        <w:tc>
+          <w:tcPr>
+            <w:tcW w:type="dxa" w:w="2080"/>
+            <w:tcBorders>
+              <w:top w:val="single" w:color="CCCCCC" w:sz="1"/>
+              <w:left w:val="single" w:color="CCCCCC" w:sz="1"/>
+              <w:bottom w:val="single" w:color="CCCCCC" w:sz="1"/>
+              <w:right w:val="single" w:color="CCCCCC" w:sz="1"/>
+            </w:tcBorders>
+            <w:shd w:fill="FFFFFF" w:val="clear"/>
+            <w:tcMar>
+              <w:top w:type="dxa" w:w="80"/>
+              <w:left w:type="dxa" w:w="120"/>
+              <w:bottom w:type="dxa" w:w="80"/>
+              <w:right w:type="dxa" w:w="120"/>
+            </w:tcMar>
+          </w:tcPr>
+          <w:p>
+            <w:r>
+              <w:rPr>
+                <w:rFonts w:ascii="Arial" w:cs="Arial" w:eastAsia="Arial" w:hAnsi="Arial"/>
+                <w:b w:val="false"/>
+                <w:bCs w:val="false"/>
+                <w:sz w:val="18"/>
+                <w:szCs w:val="18"/>
+              </w:rPr>
+              <w:t xml:space="preserve">Should add</w:t>
+            </w:r>
+          </w:p>
+        </w:tc>
+        <w:tc>
+          <w:tcPr>
+            <w:tcW w:type="dxa" w:w="4160"/>
+            <w:tcBorders>
+              <w:top w:val="single" w:color="CCCCCC" w:sz="1"/>
+              <w:left w:val="single" w:color="CCCCCC" w:sz="1"/>
+              <w:bottom w:val="single" w:color="CCCCCC" w:sz="1"/>
+              <w:right w:val="single" w:color="CCCCCC" w:sz="1"/>
+            </w:tcBorders>
+            <w:shd w:fill="FFFFFF" w:val="clear"/>
+            <w:tcMar>
+              <w:top w:type="dxa" w:w="80"/>
+              <w:left w:type="dxa" w:w="120"/>
+              <w:bottom w:type="dxa" w:w="80"/>
+              <w:right w:type="dxa" w:w="120"/>
+            </w:tcMar>
+          </w:tcPr>
+          <w:p>
+            <w:r>
+              <w:rPr>
+                <w:rFonts w:ascii="Arial" w:cs="Arial" w:eastAsia="Arial" w:hAnsi="Arial"/>
+                <w:b w:val="false"/>
+                <w:bCs w:val="false"/>
+                <w:sz w:val="18"/>
+                <w:szCs w:val="18"/>
+              </w:rPr>
+              <w:t xml:space="preserve">Implemented in src/risk/backtest.py; not yet surfaced as default UI output</w:t>
+            </w:r>
+          </w:p>
+        </w:tc>
+      </w:tr>
+      <w:tr>
+        <w:tc>
+          <w:tcPr>
+            <w:tcW w:type="dxa" w:w="3120"/>
+            <w:tcBorders>
+              <w:top w:val="single" w:color="CCCCCC" w:sz="1"/>
+              <w:left w:val="single" w:color="CCCCCC" w:sz="1"/>
+              <w:bottom w:val="single" w:color="CCCCCC" w:sz="1"/>
+              <w:right w:val="single" w:color="CCCCCC" w:sz="1"/>
+            </w:tcBorders>
+            <w:shd w:fill="FFFFFF" w:val="clear"/>
+            <w:tcMar>
+              <w:top w:type="dxa" w:w="80"/>
+              <w:left w:type="dxa" w:w="120"/>
+              <w:bottom w:type="dxa" w:w="80"/>
+              <w:right w:type="dxa" w:w="120"/>
+            </w:tcMar>
+          </w:tcPr>
+          <w:p>
+            <w:r>
+              <w:rPr>
+                <w:rFonts w:ascii="Arial" w:cs="Arial" w:eastAsia="Arial" w:hAnsi="Arial"/>
+                <w:b w:val="false"/>
+                <w:bCs w:val="false"/>
+                <w:sz w:val="18"/>
+                <w:szCs w:val="18"/>
+              </w:rPr>
+              <w:t xml:space="preserve">Conditional coverage (LR_cc)</w:t>
+            </w:r>
+          </w:p>
+        </w:tc>
+        <w:tc>
+          <w:tcPr>
+            <w:tcW w:type="dxa" w:w="2080"/>
+            <w:tcBorders>
+              <w:top w:val="single" w:color="CCCCCC" w:sz="1"/>
+              <w:left w:val="single" w:color="CCCCCC" w:sz="1"/>
+              <w:bottom w:val="single" w:color="CCCCCC" w:sz="1"/>
+              <w:right w:val="single" w:color="CCCCCC" w:sz="1"/>
+            </w:tcBorders>
+            <w:shd w:fill="FFFFFF" w:val="clear"/>
+            <w:tcMar>
+              <w:top w:type="dxa" w:w="80"/>
+              <w:left w:type="dxa" w:w="120"/>
+              <w:bottom w:type="dxa" w:w="80"/>
+              <w:right w:type="dxa" w:w="120"/>
+            </w:tcMar>
+          </w:tcPr>
+          <w:p>
+            <w:r>
+              <w:rPr>
+                <w:rFonts w:ascii="Arial" w:cs="Arial" w:eastAsia="Arial" w:hAnsi="Arial"/>
+                <w:b w:val="false"/>
+                <w:bCs w:val="false"/>
+                <w:sz w:val="18"/>
+                <w:szCs w:val="18"/>
+              </w:rPr>
+              <w:t xml:space="preserve">Should add</w:t>
+            </w:r>
+          </w:p>
+        </w:tc>
+        <w:tc>
+          <w:tcPr>
+            <w:tcW w:type="dxa" w:w="4160"/>
+            <w:tcBorders>
+              <w:top w:val="single" w:color="CCCCCC" w:sz="1"/>
+              <w:left w:val="single" w:color="CCCCCC" w:sz="1"/>
+              <w:bottom w:val="single" w:color="CCCCCC" w:sz="1"/>
+              <w:right w:val="single" w:color="CCCCCC" w:sz="1"/>
+            </w:tcBorders>
+            <w:shd w:fill="FFFFFF" w:val="clear"/>
+            <w:tcMar>
+              <w:top w:type="dxa" w:w="80"/>
+              <w:left w:type="dxa" w:w="120"/>
+              <w:bottom w:type="dxa" w:w="80"/>
+              <w:right w:type="dxa" w:w="120"/>
+            </w:tcMar>
+          </w:tcPr>
+          <w:p>
+            <w:r>
+              <w:rPr>
+                <w:rFonts w:ascii="Arial" w:cs="Arial" w:eastAsia="Arial" w:hAnsi="Arial"/>
+                <w:b w:val="false"/>
+                <w:bCs w:val="false"/>
+                <w:sz w:val="18"/>
+                <w:szCs w:val="18"/>
+              </w:rPr>
+              <w:t xml:space="preserve">Implemented in src/risk/backtest.py; available as API call</w:t>
+            </w:r>
+          </w:p>
+        </w:tc>
+      </w:tr>
+      <w:tr>
+        <w:tc>
+          <w:tcPr>
+            <w:tcW w:type="dxa" w:w="3120"/>
+            <w:tcBorders>
+              <w:top w:val="single" w:color="CCCCCC" w:sz="1"/>
+              <w:left w:val="single" w:color="CCCCCC" w:sz="1"/>
+              <w:bottom w:val="single" w:color="CCCCCC" w:sz="1"/>
+              <w:right w:val="single" w:color="CCCCCC" w:sz="1"/>
+            </w:tcBorders>
+            <w:shd w:fill="FFFFFF" w:val="clear"/>
+            <w:tcMar>
+              <w:top w:type="dxa" w:w="80"/>
+              <w:left w:type="dxa" w:w="120"/>
+              <w:bottom w:type="dxa" w:w="80"/>
+              <w:right w:type="dxa" w:w="120"/>
+            </w:tcMar>
+          </w:tcPr>
+          <w:p>
+            <w:r>
+              <w:rPr>
+                <w:rFonts w:ascii="Arial" w:cs="Arial" w:eastAsia="Arial" w:hAnsi="Arial"/>
+                <w:b w:val="false"/>
+                <w:bCs w:val="false"/>
+                <w:sz w:val="18"/>
+                <w:szCs w:val="18"/>
+              </w:rPr>
+              <w:t xml:space="preserve">Multiple VaR percentiles (95%, 97.5%, 99%)</w:t>
+            </w:r>
+          </w:p>
+        </w:tc>
+        <w:tc>
+          <w:tcPr>
+            <w:tcW w:type="dxa" w:w="2080"/>
+            <w:tcBorders>
+              <w:top w:val="single" w:color="CCCCCC" w:sz="1"/>
+              <w:left w:val="single" w:color="CCCCCC" w:sz="1"/>
+              <w:bottom w:val="single" w:color="CCCCCC" w:sz="1"/>
+              <w:right w:val="single" w:color="CCCCCC" w:sz="1"/>
+            </w:tcBorders>
+            <w:shd w:fill="FFFFFF" w:val="clear"/>
+            <w:tcMar>
+              <w:top w:type="dxa" w:w="80"/>
+              <w:left w:type="dxa" w:w="120"/>
+              <w:bottom w:type="dxa" w:w="80"/>
+              <w:right w:type="dxa" w:w="120"/>
+            </w:tcMar>
+          </w:tcPr>
+          <w:p>
+            <w:r>
+              <w:rPr>
+                <w:rFonts w:ascii="Arial" w:cs="Arial" w:eastAsia="Arial" w:hAnsi="Arial"/>
+                <w:b w:val="false"/>
+                <w:bCs w:val="false"/>
+                <w:sz w:val="18"/>
+                <w:szCs w:val="18"/>
+              </w:rPr>
+              <w:t xml:space="preserve">Should add</w:t>
+            </w:r>
+          </w:p>
+        </w:tc>
+        <w:tc>
+          <w:tcPr>
+            <w:tcW w:type="dxa" w:w="4160"/>
+            <w:tcBorders>
+              <w:top w:val="single" w:color="CCCCCC" w:sz="1"/>
+              <w:left w:val="single" w:color="CCCCCC" w:sz="1"/>
+              <w:bottom w:val="single" w:color="CCCCCC" w:sz="1"/>
+              <w:right w:val="single" w:color="CCCCCC" w:sz="1"/>
+            </w:tcBorders>
+            <w:shd w:fill="FFFFFF" w:val="clear"/>
+            <w:tcMar>
+              <w:top w:type="dxa" w:w="80"/>
+              <w:left w:type="dxa" w:w="120"/>
+              <w:bottom w:type="dxa" w:w="80"/>
+              <w:right w:type="dxa" w:w="120"/>
+            </w:tcMar>
+          </w:tcPr>
+          <w:p>
+            <w:r>
+              <w:rPr>
+                <w:rFonts w:ascii="Arial" w:cs="Arial" w:eastAsia="Arial" w:hAnsi="Arial"/>
+                <w:b w:val="false"/>
+                <w:bCs w:val="false"/>
+                <w:sz w:val="18"/>
+                <w:szCs w:val="18"/>
+              </w:rPr>
+              <w:t xml:space="preserve">Partial — UI allows any single confidence level; multi-percentile sweep is a future enhancement</w:t>
+            </w:r>
+          </w:p>
+        </w:tc>
+      </w:tr>
+      <w:tr>
+        <w:tc>
+          <w:tcPr>
+            <w:tcW w:type="dxa" w:w="3120"/>
+            <w:tcBorders>
+              <w:top w:val="single" w:color="CCCCCC" w:sz="1"/>
+              <w:left w:val="single" w:color="CCCCCC" w:sz="1"/>
+              <w:bottom w:val="single" w:color="CCCCCC" w:sz="1"/>
+              <w:right w:val="single" w:color="CCCCCC" w:sz="1"/>
+            </w:tcBorders>
+            <w:shd w:fill="FFFFFF" w:val="clear"/>
+            <w:tcMar>
+              <w:top w:type="dxa" w:w="80"/>
+              <w:left w:type="dxa" w:w="120"/>
+              <w:bottom w:type="dxa" w:w="80"/>
+              <w:right w:type="dxa" w:w="120"/>
+            </w:tcMar>
+          </w:tcPr>
+          <w:p>
+            <w:r>
+              <w:rPr>
+                <w:rFonts w:ascii="Arial" w:cs="Arial" w:eastAsia="Arial" w:hAnsi="Arial"/>
+                <w:b w:val="false"/>
+                <w:bCs w:val="false"/>
+                <w:sz w:val="18"/>
+                <w:szCs w:val="18"/>
+              </w:rPr>
+              <w:t xml:space="preserve">ES backtesting</w:t>
+            </w:r>
+          </w:p>
+        </w:tc>
+        <w:tc>
+          <w:tcPr>
+            <w:tcW w:type="dxa" w:w="2080"/>
+            <w:tcBorders>
+              <w:top w:val="single" w:color="CCCCCC" w:sz="1"/>
+              <w:left w:val="single" w:color="CCCCCC" w:sz="1"/>
+              <w:bottom w:val="single" w:color="CCCCCC" w:sz="1"/>
+              <w:right w:val="single" w:color="CCCCCC" w:sz="1"/>
+            </w:tcBorders>
+            <w:shd w:fill="FFFFFF" w:val="clear"/>
+            <w:tcMar>
+              <w:top w:type="dxa" w:w="80"/>
+              <w:left w:type="dxa" w:w="120"/>
+              <w:bottom w:type="dxa" w:w="80"/>
+              <w:right w:type="dxa" w:w="120"/>
+            </w:tcMar>
+          </w:tcPr>
+          <w:p>
+            <w:r>
+              <w:rPr>
+                <w:rFonts w:ascii="Arial" w:cs="Arial" w:eastAsia="Arial" w:hAnsi="Arial"/>
+                <w:b w:val="false"/>
+                <w:bCs w:val="false"/>
+                <w:sz w:val="18"/>
+                <w:szCs w:val="18"/>
+              </w:rPr>
+              <w:t xml:space="preserve">Optional extension</w:t>
+            </w:r>
+          </w:p>
+        </w:tc>
+        <w:tc>
+          <w:tcPr>
+            <w:tcW w:type="dxa" w:w="4160"/>
+            <w:tcBorders>
+              <w:top w:val="single" w:color="CCCCCC" w:sz="1"/>
+              <w:left w:val="single" w:color="CCCCCC" w:sz="1"/>
+              <w:bottom w:val="single" w:color="CCCCCC" w:sz="1"/>
+              <w:right w:val="single" w:color="CCCCCC" w:sz="1"/>
+            </w:tcBorders>
+            <w:shd w:fill="FFFFFF" w:val="clear"/>
+            <w:tcMar>
+              <w:top w:type="dxa" w:w="80"/>
+              <w:left w:type="dxa" w:w="120"/>
+              <w:bottom w:type="dxa" w:w="80"/>
+              <w:right w:type="dxa" w:w="120"/>
+            </w:tcMar>
+          </w:tcPr>
+          <w:p>
+            <w:r>
+              <w:rPr>
+                <w:rFonts w:ascii="Arial" w:cs="Arial" w:eastAsia="Arial" w:hAnsi="Arial"/>
+                <w:b w:val="false"/>
+                <w:bCs w:val="false"/>
+                <w:sz w:val="18"/>
+                <w:szCs w:val="18"/>
+              </w:rPr>
+              <w:t xml:space="preserve">Not yet implemented; ES validation relies on ES &gt;= VaR structural check and formula-level unit tests</w:t>
+            </w:r>
+          </w:p>
+        </w:tc>
+      </w:tr>
+    </w:tbl>
+    <w:p>
+      <w:pPr>
+        <w:spacing w:after="80" w:before="80"/>
+      </w:pPr>
+      <w:r>
+        <w:rPr>
+          <w:rFonts w:ascii="Arial" w:cs="Arial" w:eastAsia="Arial" w:hAnsi="Arial"/>
+          <w:sz w:val="22"/>
+          <w:szCs w:val="22"/>
+        </w:rPr>
+        <w:t xml:space="preserve">ES validation note: Direct ES backtesting is more complex than VaR backtesting because ES is not elicitable in the classical sense. Current validation relies on: (1) confirming ES &gt;= VaR for all methods, (2) unit tests against analytical ES formulas, (3) confirming the ES &gt;= VaR relationship holds across simulated loss distributions. A future enhancement would implement a joint VaR/ES regression test or a Murphy diagram.</w:t>
+      </w:r>
+    </w:p>
+    <w:p>
+      <w:r>
+        <w:br w:type="page"/>
+      </w:r>
+    </w:p>
+    <w:p>
+      <w:pPr>
+        <w:pStyle w:val="Heading1"/>
+        <w:pBdr>
+          <w:bottom w:val="single" w:color="2E75B6" w:sz="6" w:space="4"/>
+        </w:pBdr>
+        <w:spacing w:after="160" w:before="320"/>
+      </w:pPr>
+      <w:r>
+        <w:rPr>
+          <w:rFonts w:ascii="Arial" w:cs="Arial" w:eastAsia="Arial" w:hAnsi="Arial"/>
+          <w:b/>
+          <w:bCs/>
+          <w:color w:val="1F3864"/>
+          <w:sz w:val="32"/>
+          <w:szCs w:val="32"/>
+        </w:rPr>
+        <w:t xml:space="preserve">4  Application Screenshots</w:t>
+      </w:r>
+    </w:p>
+    <w:p>
+      <w:pPr>
+        <w:spacing w:after="80" w:before="80"/>
+      </w:pPr>
+      <w:r>
+        <w:rPr>
+          <w:rFonts w:ascii="Arial" w:cs="Arial" w:eastAsia="Arial" w:hAnsi="Arial"/>
+          <w:sz w:val="22"/>
+          <w:szCs w:val="22"/>
+        </w:rPr>
+        <w:t xml:space="preserve">The following screenshots were captured from the live application running at localhost:8502 against five years of Yahoo Finance data (AAPL + MSFT, 2021-05-11 to 2026-05-08, 1,255 trading days).</w:t>
+      </w:r>
+    </w:p>
+    <w:p/>
+    <w:p>
+      <w:pPr>
+        <w:pStyle w:val="Heading2"/>
+        <w:spacing w:after="120" w:before="240"/>
+      </w:pPr>
+      <w:r>
+        <w:rPr>
+          <w:rFonts w:ascii="Arial" w:cs="Arial" w:eastAsia="Arial" w:hAnsi="Arial"/>
+          <w:b/>
+          <w:bCs/>
+          <w:color w:val="2E75B6"/>
+          <w:sz w:val="26"/>
+          <w:szCs w:val="26"/>
+        </w:rPr>
+        <w:t xml:space="preserve">4.1  Tab 1 — Portfolio Input</w:t>
       </w:r>
     </w:p>
     <w:p>
@@ -3179,7 +6868,7 @@
           <w:sz w:val="26"/>
           <w:szCs w:val="26"/>
         </w:rPr>
-        <w:t xml:space="preserve">3.2  Tab 2 — Market Data</w:t>
+        <w:t xml:space="preserve">4.2  Tab 2 — Market Data</w:t>
       </w:r>
     </w:p>
     <w:p>
@@ -3272,7 +6961,7 @@
           <w:sz w:val="26"/>
           <w:szCs w:val="26"/>
         </w:rPr>
-        <w:t xml:space="preserve">3.3  Tab 3 — Risk Settings</w:t>
+        <w:t xml:space="preserve">4.3  Tab 3 — Risk Settings</w:t>
       </w:r>
     </w:p>
     <w:p>
@@ -3365,7 +7054,7 @@
           <w:sz w:val="26"/>
           <w:szCs w:val="26"/>
         </w:rPr>
-        <w:t xml:space="preserve">3.4  Tab 4 — Run Analysis</w:t>
+        <w:t xml:space="preserve">4.4  Tab 4 — Run Analysis</w:t>
       </w:r>
     </w:p>
     <w:p>
@@ -3458,7 +7147,7 @@
           <w:sz w:val="26"/>
           <w:szCs w:val="26"/>
         </w:rPr>
-        <w:t xml:space="preserve">3.5  Tab 5 — Backtesting</w:t>
+        <w:t xml:space="preserve">4.5  Tab 5 — Backtesting</w:t>
       </w:r>
     </w:p>
     <w:p>
@@ -3551,7 +7240,7 @@
           <w:sz w:val="26"/>
           <w:szCs w:val="26"/>
         </w:rPr>
-        <w:t xml:space="preserve">3.6  Tab 6 — Credit Risk</w:t>
+        <w:t xml:space="preserve">4.6  Tab 6 — Credit Risk</w:t>
       </w:r>
     </w:p>
     <w:p>
@@ -3644,7 +7333,7 @@
           <w:sz w:val="26"/>
           <w:szCs w:val="26"/>
         </w:rPr>
-        <w:t xml:space="preserve">3.7  Tab 7 — CDS / CVA</w:t>
+        <w:t xml:space="preserve">4.7  Tab 7 — CDS / CVA</w:t>
       </w:r>
     </w:p>
     <w:p>
@@ -3737,7 +7426,7 @@
           <w:sz w:val="26"/>
           <w:szCs w:val="26"/>
         </w:rPr>
-        <w:t xml:space="preserve">3.8  Tab 8 — Capital &amp; Stress</w:t>
+        <w:t xml:space="preserve">4.8  Tab 8 — Capital &amp; Stress</w:t>
       </w:r>
     </w:p>
     <w:p>
@@ -3838,7 +7527,7 @@
           <w:sz w:val="32"/>
           <w:szCs w:val="32"/>
         </w:rPr>
-        <w:t xml:space="preserve">4  Product / System Description</w:t>
+        <w:t xml:space="preserve">5  Product / System Description</w:t>
       </w:r>
     </w:p>
     <w:p>
@@ -5920,7 +9609,7 @@
           <w:sz w:val="32"/>
           <w:szCs w:val="32"/>
         </w:rPr>
-        <w:t xml:space="preserve">5  Model Description</w:t>
+        <w:t xml:space="preserve">6  Model Description</w:t>
       </w:r>
     </w:p>
     <w:p>
@@ -7660,7 +11349,7 @@
           <w:sz w:val="32"/>
           <w:szCs w:val="32"/>
         </w:rPr>
-        <w:t xml:space="preserve">6  Software Design and Implementation</w:t>
+        <w:t xml:space="preserve">7  Software Design and Implementation</w:t>
       </w:r>
     </w:p>
     <w:p>
@@ -9234,7 +12923,7 @@
           <w:sz w:val="32"/>
           <w:szCs w:val="32"/>
         </w:rPr>
-        <w:t xml:space="preserve">7  Validation Methodology and Scope</w:t>
+        <w:t xml:space="preserve">8  Validation Methodology and Scope</w:t>
       </w:r>
     </w:p>
     <w:p>
@@ -10900,7 +14589,7 @@
           <w:sz w:val="32"/>
           <w:szCs w:val="32"/>
         </w:rPr>
-        <w:t xml:space="preserve">8  Validation Results</w:t>
+        <w:t xml:space="preserve">9  Validation Results</w:t>
       </w:r>
     </w:p>
     <w:p>
@@ -13679,7 +17368,7 @@
           <w:sz w:val="32"/>
           <w:szCs w:val="32"/>
         </w:rPr>
-        <w:t xml:space="preserve">9  Limitations</w:t>
+        <w:t xml:space="preserve">10  Limitations</w:t>
       </w:r>
     </w:p>
     <w:tbl>
@@ -14946,7 +18635,7 @@
           <w:sz w:val="32"/>
           <w:szCs w:val="32"/>
         </w:rPr>
-        <w:t xml:space="preserve">10  Recommendations</w:t>
+        <w:t xml:space="preserve">11  Recommendations</w:t>
       </w:r>
     </w:p>
     <w:p>
@@ -15062,7 +18751,7 @@
           <w:sz w:val="32"/>
           <w:szCs w:val="32"/>
         </w:rPr>
-        <w:t xml:space="preserve">11  Bibliography</w:t>
+        <w:t xml:space="preserve">12  Bibliography</w:t>
       </w:r>
     </w:p>
     <w:p>
@@ -15178,7 +18867,7 @@
           <w:sz w:val="32"/>
           <w:szCs w:val="32"/>
         </w:rPr>
-        <w:t xml:space="preserve">12  Appendices</w:t>
+        <w:t xml:space="preserve">13  Appendices</w:t>
       </w:r>
     </w:p>
     <w:p>

</xml_diff>

<commit_message>
Fix screenshots: replace desktop wallpaper with actual app captures
All 8 tab screenshots recaptured via html2canvas from the live
Streamlit app (localhost:8502) — no more desktop wallpaper.
Thumbnails regenerated (729×750). Word document rebuilt with the
correct screenshots embedded (0.9 MB, 783 paragraphs, validated).

Tabs captured: Portfolio Input · Market Data · Risk Settings ·
Run Analysis (VaR $11,095.68) · Backtesting (10 exceptions, 1.00%)
· Credit Risk (180 bps CDS) · CDS/CVA · Capital & Stress (22.84% PASS)
</commit_message>
<xml_diff>
--- a/FINAL_REPORT.docx
+++ b/FINAL_REPORT.docx
@@ -6908,7 +6908,7 @@
                     </pic:cNvPicPr>
                   </pic:nvPicPr>
                   <pic:blipFill>
-                    <a:blip r:embed="rId9" cstate="none"/>
+                    <a:blip r:embed="rId10" cstate="none"/>
                     <a:srcRect/>
                     <a:stretch>
                       <a:fillRect/>
@@ -7001,7 +7001,7 @@
                     </pic:cNvPicPr>
                   </pic:nvPicPr>
                   <pic:blipFill>
-                    <a:blip r:embed="rId9" cstate="none"/>
+                    <a:blip r:embed="rId11" cstate="none"/>
                     <a:srcRect/>
                     <a:stretch>
                       <a:fillRect/>
@@ -7094,7 +7094,7 @@
                     </pic:cNvPicPr>
                   </pic:nvPicPr>
                   <pic:blipFill>
-                    <a:blip r:embed="rId9" cstate="none"/>
+                    <a:blip r:embed="rId12" cstate="none"/>
                     <a:srcRect/>
                     <a:stretch>
                       <a:fillRect/>
@@ -7187,7 +7187,7 @@
                     </pic:cNvPicPr>
                   </pic:nvPicPr>
                   <pic:blipFill>
-                    <a:blip r:embed="rId9" cstate="none"/>
+                    <a:blip r:embed="rId13" cstate="none"/>
                     <a:srcRect/>
                     <a:stretch>
                       <a:fillRect/>
@@ -7280,7 +7280,7 @@
                     </pic:cNvPicPr>
                   </pic:nvPicPr>
                   <pic:blipFill>
-                    <a:blip r:embed="rId9" cstate="none"/>
+                    <a:blip r:embed="rId14" cstate="none"/>
                     <a:srcRect/>
                     <a:stretch>
                       <a:fillRect/>
@@ -7373,7 +7373,7 @@
                     </pic:cNvPicPr>
                   </pic:nvPicPr>
                   <pic:blipFill>
-                    <a:blip r:embed="rId9" cstate="none"/>
+                    <a:blip r:embed="rId15" cstate="none"/>
                     <a:srcRect/>
                     <a:stretch>
                       <a:fillRect/>
@@ -7466,7 +7466,7 @@
                     </pic:cNvPicPr>
                   </pic:nvPicPr>
                   <pic:blipFill>
-                    <a:blip r:embed="rId9" cstate="none"/>
+                    <a:blip r:embed="rId16" cstate="none"/>
                     <a:srcRect/>
                     <a:stretch>
                       <a:fillRect/>

</xml_diff>